<commit_message>
docx: RULES.md + prose lint; demote scalar inline math to text
- tools/lint_docx.sh: ITB prose lint adapted from lint-itb.sh for docx
  (pandoc text extraction + docx-specific FATAL checks + caption orphan check)
- preprocess_tex.py: demote_simple_math() - scalar expressions like
  $r = 0{,}507$ become plain text (OMML renders decimal comma as '0 , 507')
- RULES.md: DOCX style map, caption/REF/SEQ recipes, citation + prose rules

Co-Authored-By: Claude Fable 5 <noreply@anthropic.com>
</commit_message>
<xml_diff>
--- a/dissertation-docx/chapters/bab6.docx
+++ b/dissertation-docx/chapters/bab6.docx
@@ -2061,31 +2061,18 @@
       <w:r>
         <w:t xml:space="preserve"> </w:t>
       </w:r>
-      <m:oMath>
-        <m:r>
-          <m:t>r</m:t>
-        </m:r>
-        <m:r>
-          <m:rPr>
-            <m:sty m:val="p"/>
-          </m:rPr>
-          <m:t>=</m:t>
-        </m:r>
-        <m:r>
-          <m:t>0</m:t>
-        </m:r>
-        <m:r>
-          <m:rPr>
-            <m:sty m:val="p"/>
-          </m:rPr>
-          <m:t>,</m:t>
-        </m:r>
-        <m:r>
-          <m:t>507</m:t>
-        </m:r>
-      </m:oMath>
-      <w:r>
-        <w:t xml:space="preserve">. Pada XJTU-SY, BPFO</w:t>
+      <w:r>
+        <w:rPr>
+          <w:i/>
+          <w:iCs/>
+        </w:rPr>
+        <w:t xml:space="preserve">r</w:t>
+      </w:r>
+      <w:r>
+        <w:t xml:space="preserve"> </w:t>
+      </w:r>
+      <w:r>
+        <w:t xml:space="preserve">= 0,507. Pada XJTU-SY, BPFO</w:t>
       </w:r>
       <w:r>
         <w:t xml:space="preserve"> </w:t>
@@ -2112,31 +2099,18 @@
       <w:r>
         <w:t xml:space="preserve"> </w:t>
       </w:r>
-      <m:oMath>
-        <m:r>
-          <m:t>r</m:t>
-        </m:r>
-        <m:r>
-          <m:rPr>
-            <m:sty m:val="p"/>
-          </m:rPr>
-          <m:t>=</m:t>
-        </m:r>
-        <m:r>
-          <m:t>0</m:t>
-        </m:r>
-        <m:r>
-          <m:rPr>
-            <m:sty m:val="p"/>
-          </m:rPr>
-          <m:t>,</m:t>
-        </m:r>
-        <m:r>
-          <m:t>501</m:t>
-        </m:r>
-      </m:oMath>
-      <w:r>
-        <w:t xml:space="preserve">.</w:t>
+      <w:r>
+        <w:rPr>
+          <w:i/>
+          <w:iCs/>
+        </w:rPr>
+        <w:t xml:space="preserve">r</w:t>
+      </w:r>
+      <w:r>
+        <w:t xml:space="preserve"> </w:t>
+      </w:r>
+      <w:r>
+        <w:t xml:space="preserve">= 0,501.</w:t>
       </w:r>
       <w:r>
         <w:t xml:space="preserve"> </w:t>
@@ -3649,19 +3623,8 @@
       <w:r>
         <w:t xml:space="preserve"> </w:t>
       </w:r>
-      <m:oMath>
-        <m:r>
-          <m:rPr>
-            <m:sty m:val="p"/>
-          </m:rPr>
-          <m:t>→</m:t>
-        </m:r>
-      </m:oMath>
-      <w:r>
-        <w:t xml:space="preserve"> </w:t>
-      </w:r>
-      <w:r>
-        <w:t xml:space="preserve">0,735), dengan kata lain</w:t>
+      <w:r>
+        <w:t xml:space="preserve">→ 0,735), dengan kata lain</w:t>
       </w:r>
       <w:r>
         <w:t xml:space="preserve"> </w:t>

</xml_diff>

<commit_message>
chore(.gitignore): exclude loose DOCX drafts, LaTeX build figures, and journal-q2
- Ignore *.docx/*.pptx at root (seminar drafts, not tracked content)
- Exclude writings/disertation/figures/bab2-6/ and research_flow.png
  (generated copies of dissertation-docx/assets/figures — source of truth
  stays in dissertation-docx/)
- Exclude dissertation-docx/build/ (PDF build output, regenerable)
- Exclude writings/journal-q2/ (separate publication, not dissertation core)
- Add inference-engine/__pycache__ exclusion

Co-authored-by: Cursor <cursoragent@cursor.com>
</commit_message>
<xml_diff>
--- a/dissertation-docx/chapters/bab6.docx
+++ b/dissertation-docx/chapters/bab6.docx
@@ -494,60 +494,219 @@
         <w:t xml:space="preserve"> </w:t>
       </w:r>
       <w:r>
+        <w:rPr>
+          <w:color w:val="0000FF"/>
+        </w:rPr>
         <w:t xml:space="preserve">menurunkan</w:t>
       </w:r>
       <w:r>
-        <w:t xml:space="preserve"> </w:t>
-      </w:r>
-      <w:r>
-        <w:rPr>
-          <w:i/>
-          <w:iCs/>
+        <w:rPr>
+          <w:color w:val="0000FF"/>
+        </w:rPr>
+        <w:t xml:space="preserve"> </w:t>
+      </w:r>
+      <w:r>
+        <w:rPr>
+          <w:i/>
+          <w:iCs/>
+          <w:color w:val="0000FF"/>
         </w:rPr>
         <w:t xml:space="preserve">discriminability</w:t>
       </w:r>
       <w:r>
-        <w:t xml:space="preserve"> </w:t>
-      </w:r>
-      <w:r>
-        <w:t xml:space="preserve">FSM; sebaliknya, penghapusan</w:t>
-      </w:r>
-      <w:r>
-        <w:t xml:space="preserve"> </w:t>
-      </w:r>
-      <w:r>
-        <w:rPr>
-          <w:i/>
-          <w:iCs/>
+        <w:rPr>
+          <w:color w:val="0000FF"/>
+        </w:rPr>
+        <w:t xml:space="preserve"> </w:t>
+      </w:r>
+      <w:r>
+        <w:rPr>
+          <w:color w:val="0000FF"/>
+        </w:rPr>
+        <w:t xml:space="preserve">FSM;</w:t>
+      </w:r>
+      <w:r>
+        <w:rPr>
+          <w:color w:val="0000FF"/>
+        </w:rPr>
+        <w:t xml:space="preserve"> </w:t>
+      </w:r>
+      <w:r>
+        <w:rPr>
+          <w:color w:val="0000FF"/>
+        </w:rPr>
+        <w:t xml:space="preserve">sebaliknya,</w:t>
+      </w:r>
+      <w:r>
+        <w:rPr>
+          <w:color w:val="0000FF"/>
+        </w:rPr>
+        <w:t xml:space="preserve"> </w:t>
+      </w:r>
+      <w:r>
+        <w:rPr>
+          <w:color w:val="0000FF"/>
+        </w:rPr>
+        <w:t xml:space="preserve">penghapusan</w:t>
+      </w:r>
+      <w:r>
+        <w:rPr>
+          <w:color w:val="0000FF"/>
+        </w:rPr>
+        <w:t xml:space="preserve"> </w:t>
+      </w:r>
+      <w:r>
+        <w:rPr>
+          <w:i/>
+          <w:iCs/>
+          <w:color w:val="0000FF"/>
         </w:rPr>
         <w:t xml:space="preserve">BatchNorm</w:t>
       </w:r>
       <w:r>
-        <w:t xml:space="preserve"> </w:t>
-      </w:r>
-      <w:r>
+        <w:rPr>
+          <w:color w:val="0000FF"/>
+        </w:rPr>
+        <w:t xml:space="preserve"> </w:t>
+      </w:r>
+      <w:r>
+        <w:rPr>
+          <w:color w:val="0000FF"/>
+        </w:rPr>
         <w:t xml:space="preserve">menaikkan</w:t>
       </w:r>
       <w:r>
-        <w:t xml:space="preserve"> </w:t>
-      </w:r>
-      <w:r>
-        <w:rPr>
-          <w:i/>
-          <w:iCs/>
+        <w:rPr>
+          <w:color w:val="0000FF"/>
+        </w:rPr>
+        <w:t xml:space="preserve"> </w:t>
+      </w:r>
+      <w:r>
+        <w:rPr>
+          <w:i/>
+          <w:iCs/>
+          <w:color w:val="0000FF"/>
         </w:rPr>
         <w:t xml:space="preserve">discriminability</w:t>
       </w:r>
       <w:r>
-        <w:t xml:space="preserve"> </w:t>
-      </w:r>
-      <w:r>
-        <w:t xml:space="preserve">FSM sebesar 133% (dari 0,315 menjadi 0,735 pada subset</w:t>
-      </w:r>
-      <w:r>
-        <w:t xml:space="preserve"> </w:t>
-      </w:r>
-      <w:r>
+        <w:rPr>
+          <w:color w:val="0000FF"/>
+        </w:rPr>
+        <w:t xml:space="preserve"> </w:t>
+      </w:r>
+      <w:r>
+        <w:rPr>
+          <w:color w:val="0000FF"/>
+        </w:rPr>
+        <w:t xml:space="preserve">FSM</w:t>
+      </w:r>
+      <w:r>
+        <w:rPr>
+          <w:color w:val="0000FF"/>
+        </w:rPr>
+        <w:t xml:space="preserve"> </w:t>
+      </w:r>
+      <w:r>
+        <w:rPr>
+          <w:color w:val="0000FF"/>
+        </w:rPr>
+        <w:t xml:space="preserve">sebesar</w:t>
+      </w:r>
+      <w:r>
+        <w:rPr>
+          <w:color w:val="0000FF"/>
+        </w:rPr>
+        <w:t xml:space="preserve"> </w:t>
+      </w:r>
+      <w:r>
+        <w:rPr>
+          <w:color w:val="0000FF"/>
+        </w:rPr>
+        <w:t xml:space="preserve">133%</w:t>
+      </w:r>
+      <w:r>
+        <w:rPr>
+          <w:color w:val="0000FF"/>
+        </w:rPr>
+        <w:t xml:space="preserve"> </w:t>
+      </w:r>
+      <w:r>
+        <w:rPr>
+          <w:color w:val="0000FF"/>
+        </w:rPr>
+        <w:t xml:space="preserve">(dari</w:t>
+      </w:r>
+      <w:r>
+        <w:rPr>
+          <w:color w:val="0000FF"/>
+        </w:rPr>
+        <w:t xml:space="preserve"> </w:t>
+      </w:r>
+      <w:r>
+        <w:rPr>
+          <w:color w:val="0000FF"/>
+        </w:rPr>
+        <w:t xml:space="preserve">0,315</w:t>
+      </w:r>
+      <w:r>
+        <w:rPr>
+          <w:color w:val="0000FF"/>
+        </w:rPr>
+        <w:t xml:space="preserve"> </w:t>
+      </w:r>
+      <w:r>
+        <w:rPr>
+          <w:color w:val="0000FF"/>
+        </w:rPr>
+        <w:t xml:space="preserve">menjadi</w:t>
+      </w:r>
+      <w:r>
+        <w:rPr>
+          <w:color w:val="0000FF"/>
+        </w:rPr>
+        <w:t xml:space="preserve"> </w:t>
+      </w:r>
+      <w:r>
+        <w:rPr>
+          <w:color w:val="0000FF"/>
+        </w:rPr>
+        <w:t xml:space="preserve">0,735</w:t>
+      </w:r>
+      <w:r>
+        <w:rPr>
+          <w:color w:val="0000FF"/>
+        </w:rPr>
+        <w:t xml:space="preserve"> </w:t>
+      </w:r>
+      <w:r>
+        <w:rPr>
+          <w:color w:val="0000FF"/>
+        </w:rPr>
+        <w:t xml:space="preserve">pada</w:t>
+      </w:r>
+      <w:r>
+        <w:rPr>
+          <w:color w:val="0000FF"/>
+        </w:rPr>
+        <w:t xml:space="preserve"> </w:t>
+      </w:r>
+      <w:r>
+        <w:rPr>
+          <w:color w:val="0000FF"/>
+        </w:rPr>
+        <w:t xml:space="preserve">subset</w:t>
+      </w:r>
+      <w:r>
+        <w:rPr>
+          <w:color w:val="0000FF"/>
+        </w:rPr>
+        <w:t xml:space="preserve"> </w:t>
+      </w:r>
+      <w:r>
+        <w:rPr>
+          <w:color w:val="0000FF"/>
+        </w:rPr>
         <w:t xml:space="preserve">ablasi)</w:t>
       </w:r>
       <w:r>
@@ -1817,73 +1976,316 @@
         <w:t xml:space="preserve"> </w:t>
       </w:r>
       <w:r>
+        <w:rPr>
+          <w:color w:val="0000FF"/>
+        </w:rPr>
         <w:t xml:space="preserve">menurunkan</w:t>
       </w:r>
       <w:r>
-        <w:t xml:space="preserve"> </w:t>
-      </w:r>
-      <w:r>
-        <w:rPr>
-          <w:i/>
-          <w:iCs/>
+        <w:rPr>
+          <w:color w:val="0000FF"/>
+        </w:rPr>
+        <w:t xml:space="preserve"> </w:t>
+      </w:r>
+      <w:r>
+        <w:rPr>
+          <w:i/>
+          <w:iCs/>
+          <w:color w:val="0000FF"/>
         </w:rPr>
         <w:t xml:space="preserve">discriminability</w:t>
       </w:r>
       <w:r>
-        <w:t xml:space="preserve"> </w:t>
-      </w:r>
-      <w:r>
-        <w:t xml:space="preserve">FSM; secara setara,</w:t>
-      </w:r>
-      <w:r>
-        <w:t xml:space="preserve"> </w:t>
-      </w:r>
-      <w:r>
+        <w:rPr>
+          <w:color w:val="0000FF"/>
+        </w:rPr>
+        <w:t xml:space="preserve"> </w:t>
+      </w:r>
+      <w:r>
+        <w:rPr>
+          <w:color w:val="0000FF"/>
+        </w:rPr>
+        <w:t xml:space="preserve">FSM;</w:t>
+      </w:r>
+      <w:r>
+        <w:rPr>
+          <w:color w:val="0000FF"/>
+        </w:rPr>
+        <w:t xml:space="preserve"> </w:t>
+      </w:r>
+      <w:r>
+        <w:rPr>
+          <w:color w:val="0000FF"/>
+        </w:rPr>
+        <w:t xml:space="preserve">secara</w:t>
+      </w:r>
+      <w:r>
+        <w:rPr>
+          <w:color w:val="0000FF"/>
+        </w:rPr>
+        <w:t xml:space="preserve"> </w:t>
+      </w:r>
+      <w:r>
+        <w:rPr>
+          <w:color w:val="0000FF"/>
+        </w:rPr>
+        <w:t xml:space="preserve">setara,</w:t>
+      </w:r>
+      <w:r>
+        <w:rPr>
+          <w:color w:val="0000FF"/>
+        </w:rPr>
+        <w:t xml:space="preserve"> </w:t>
+      </w:r>
+      <w:r>
+        <w:rPr>
+          <w:color w:val="0000FF"/>
+        </w:rPr>
         <w:t xml:space="preserve">penghapusan</w:t>
       </w:r>
       <w:r>
-        <w:t xml:space="preserve"> </w:t>
-      </w:r>
-      <w:r>
-        <w:rPr>
-          <w:i/>
-          <w:iCs/>
+        <w:rPr>
+          <w:color w:val="0000FF"/>
+        </w:rPr>
+        <w:t xml:space="preserve"> </w:t>
+      </w:r>
+      <w:r>
+        <w:rPr>
+          <w:i/>
+          <w:iCs/>
+          <w:color w:val="0000FF"/>
         </w:rPr>
         <w:t xml:space="preserve">BatchNorm</w:t>
       </w:r>
       <w:r>
-        <w:t xml:space="preserve"> </w:t>
-      </w:r>
-      <w:r>
+        <w:rPr>
+          <w:color w:val="0000FF"/>
+        </w:rPr>
+        <w:t xml:space="preserve"> </w:t>
+      </w:r>
+      <w:r>
+        <w:rPr>
+          <w:color w:val="0000FF"/>
+        </w:rPr>
         <w:t xml:space="preserve">menaikkan</w:t>
       </w:r>
       <w:r>
-        <w:t xml:space="preserve"> </w:t>
-      </w:r>
-      <w:r>
-        <w:rPr>
-          <w:i/>
-          <w:iCs/>
+        <w:rPr>
+          <w:color w:val="0000FF"/>
+        </w:rPr>
+        <w:t xml:space="preserve"> </w:t>
+      </w:r>
+      <w:r>
+        <w:rPr>
+          <w:i/>
+          <w:iCs/>
+          <w:color w:val="0000FF"/>
         </w:rPr>
         <w:t xml:space="preserve">discriminability</w:t>
       </w:r>
       <w:r>
-        <w:t xml:space="preserve"> </w:t>
-      </w:r>
-      <w:r>
-        <w:t xml:space="preserve">FSM sebesar 133%,</w:t>
-      </w:r>
-      <w:r>
-        <w:t xml:space="preserve"> </w:t>
-      </w:r>
-      <w:r>
-        <w:t xml:space="preserve">dari nilai 0,315 (varian A, dengan BN) menjadi 0,735 (varian C, tanpa BN) pada</w:t>
-      </w:r>
-      <w:r>
-        <w:t xml:space="preserve"> </w:t>
-      </w:r>
-      <w:r>
-        <w:t xml:space="preserve">subset ablasi</w:t>
+        <w:rPr>
+          <w:color w:val="0000FF"/>
+        </w:rPr>
+        <w:t xml:space="preserve"> </w:t>
+      </w:r>
+      <w:r>
+        <w:rPr>
+          <w:color w:val="0000FF"/>
+        </w:rPr>
+        <w:t xml:space="preserve">FSM</w:t>
+      </w:r>
+      <w:r>
+        <w:rPr>
+          <w:color w:val="0000FF"/>
+        </w:rPr>
+        <w:t xml:space="preserve"> </w:t>
+      </w:r>
+      <w:r>
+        <w:rPr>
+          <w:color w:val="0000FF"/>
+        </w:rPr>
+        <w:t xml:space="preserve">sebesar</w:t>
+      </w:r>
+      <w:r>
+        <w:rPr>
+          <w:color w:val="0000FF"/>
+        </w:rPr>
+        <w:t xml:space="preserve"> </w:t>
+      </w:r>
+      <w:r>
+        <w:rPr>
+          <w:color w:val="0000FF"/>
+        </w:rPr>
+        <w:t xml:space="preserve">133%,</w:t>
+      </w:r>
+      <w:r>
+        <w:rPr>
+          <w:color w:val="0000FF"/>
+        </w:rPr>
+        <w:t xml:space="preserve"> </w:t>
+      </w:r>
+      <w:r>
+        <w:rPr>
+          <w:color w:val="0000FF"/>
+        </w:rPr>
+        <w:t xml:space="preserve">dari</w:t>
+      </w:r>
+      <w:r>
+        <w:rPr>
+          <w:color w:val="0000FF"/>
+        </w:rPr>
+        <w:t xml:space="preserve"> </w:t>
+      </w:r>
+      <w:r>
+        <w:rPr>
+          <w:color w:val="0000FF"/>
+        </w:rPr>
+        <w:t xml:space="preserve">nilai</w:t>
+      </w:r>
+      <w:r>
+        <w:rPr>
+          <w:color w:val="0000FF"/>
+        </w:rPr>
+        <w:t xml:space="preserve"> </w:t>
+      </w:r>
+      <w:r>
+        <w:rPr>
+          <w:color w:val="0000FF"/>
+        </w:rPr>
+        <w:t xml:space="preserve">0,315</w:t>
+      </w:r>
+      <w:r>
+        <w:rPr>
+          <w:color w:val="0000FF"/>
+        </w:rPr>
+        <w:t xml:space="preserve"> </w:t>
+      </w:r>
+      <w:r>
+        <w:rPr>
+          <w:color w:val="0000FF"/>
+        </w:rPr>
+        <w:t xml:space="preserve">(varian A,</w:t>
+      </w:r>
+      <w:r>
+        <w:rPr>
+          <w:color w:val="0000FF"/>
+        </w:rPr>
+        <w:t xml:space="preserve"> </w:t>
+      </w:r>
+      <w:r>
+        <w:rPr>
+          <w:color w:val="0000FF"/>
+        </w:rPr>
+        <w:t xml:space="preserve">dengan</w:t>
+      </w:r>
+      <w:r>
+        <w:rPr>
+          <w:color w:val="0000FF"/>
+        </w:rPr>
+        <w:t xml:space="preserve"> </w:t>
+      </w:r>
+      <w:r>
+        <w:rPr>
+          <w:color w:val="0000FF"/>
+        </w:rPr>
+        <w:t xml:space="preserve">BN)</w:t>
+      </w:r>
+      <w:r>
+        <w:rPr>
+          <w:color w:val="0000FF"/>
+        </w:rPr>
+        <w:t xml:space="preserve"> </w:t>
+      </w:r>
+      <w:r>
+        <w:rPr>
+          <w:color w:val="0000FF"/>
+        </w:rPr>
+        <w:t xml:space="preserve">menjadi</w:t>
+      </w:r>
+      <w:r>
+        <w:rPr>
+          <w:color w:val="0000FF"/>
+        </w:rPr>
+        <w:t xml:space="preserve"> </w:t>
+      </w:r>
+      <w:r>
+        <w:rPr>
+          <w:color w:val="0000FF"/>
+        </w:rPr>
+        <w:t xml:space="preserve">0,735</w:t>
+      </w:r>
+      <w:r>
+        <w:rPr>
+          <w:color w:val="0000FF"/>
+        </w:rPr>
+        <w:t xml:space="preserve"> </w:t>
+      </w:r>
+      <w:r>
+        <w:rPr>
+          <w:color w:val="0000FF"/>
+        </w:rPr>
+        <w:t xml:space="preserve">(varian C,</w:t>
+      </w:r>
+      <w:r>
+        <w:rPr>
+          <w:color w:val="0000FF"/>
+        </w:rPr>
+        <w:t xml:space="preserve"> </w:t>
+      </w:r>
+      <w:r>
+        <w:rPr>
+          <w:color w:val="0000FF"/>
+        </w:rPr>
+        <w:t xml:space="preserve">tanpa</w:t>
+      </w:r>
+      <w:r>
+        <w:rPr>
+          <w:color w:val="0000FF"/>
+        </w:rPr>
+        <w:t xml:space="preserve"> </w:t>
+      </w:r>
+      <w:r>
+        <w:rPr>
+          <w:color w:val="0000FF"/>
+        </w:rPr>
+        <w:t xml:space="preserve">BN)</w:t>
+      </w:r>
+      <w:r>
+        <w:rPr>
+          <w:color w:val="0000FF"/>
+        </w:rPr>
+        <w:t xml:space="preserve"> </w:t>
+      </w:r>
+      <w:r>
+        <w:rPr>
+          <w:color w:val="0000FF"/>
+        </w:rPr>
+        <w:t xml:space="preserve">pada</w:t>
+      </w:r>
+      <w:r>
+        <w:rPr>
+          <w:color w:val="0000FF"/>
+        </w:rPr>
+        <w:t xml:space="preserve"> </w:t>
+      </w:r>
+      <w:r>
+        <w:rPr>
+          <w:color w:val="0000FF"/>
+        </w:rPr>
+        <w:t xml:space="preserve">subset</w:t>
+      </w:r>
+      <w:r>
+        <w:rPr>
+          <w:color w:val="0000FF"/>
+        </w:rPr>
+        <w:t xml:space="preserve"> </w:t>
+      </w:r>
+      <w:r>
+        <w:rPr>
+          <w:color w:val="0000FF"/>
+        </w:rPr>
+        <w:t xml:space="preserve">ablasi</w:t>
       </w:r>
       <w:r>
         <w:t xml:space="preserve">. Temuan ini memberikan panduan</w:t>
@@ -2072,45 +2474,511 @@
         <w:t xml:space="preserve"> </w:t>
       </w:r>
       <w:r>
-        <w:t xml:space="preserve">= 0,507. Pada XJTU-SY, BPFO</w:t>
-      </w:r>
-      <w:r>
-        <w:t xml:space="preserve"> </w:t>
-      </w:r>
-      <w:r>
-        <w:t xml:space="preserve">mencatat</w:t>
-      </w:r>
-      <w:r>
-        <w:t xml:space="preserve"> </w:t>
-      </w:r>
-      <w:r>
-        <w:rPr>
-          <w:i/>
-          <w:iCs/>
+        <w:t xml:space="preserve">= 0,507.</w:t>
+      </w:r>
+      <w:r>
+        <w:t xml:space="preserve"> </w:t>
+      </w:r>
+      <w:r>
+        <w:rPr>
+          <w:color w:val="0000FF"/>
+        </w:rPr>
+        <w:t xml:space="preserve">Pada</w:t>
+      </w:r>
+      <w:r>
+        <w:rPr>
+          <w:color w:val="0000FF"/>
+        </w:rPr>
+        <w:t xml:space="preserve"> </w:t>
+      </w:r>
+      <w:r>
+        <w:rPr>
+          <w:color w:val="0000FF"/>
+        </w:rPr>
+        <w:t xml:space="preserve">XJTU-SY</w:t>
+      </w:r>
+      <w:r>
+        <w:rPr>
+          <w:color w:val="0000FF"/>
+        </w:rPr>
+        <w:t xml:space="preserve"> </w:t>
+      </w:r>
+      <w:r>
+        <w:rPr>
+          <w:color w:val="0000FF"/>
+        </w:rPr>
+        <w:t xml:space="preserve">dengan</w:t>
+      </w:r>
+      <w:r>
+        <w:rPr>
+          <w:color w:val="0000FF"/>
+        </w:rPr>
+        <w:t xml:space="preserve"> </w:t>
+      </w:r>
+      <w:r>
+        <w:rPr>
+          <w:color w:val="0000FF"/>
+        </w:rPr>
+        <w:t xml:space="preserve">dataset</w:t>
+      </w:r>
+      <w:r>
+        <w:rPr>
+          <w:color w:val="0000FF"/>
+        </w:rPr>
+        <w:t xml:space="preserve"> </w:t>
+      </w:r>
+      <w:r>
+        <w:rPr>
+          <w:color w:val="0000FF"/>
+        </w:rPr>
+        <w:t xml:space="preserve">tiga</w:t>
+      </w:r>
+      <w:r>
+        <w:rPr>
+          <w:color w:val="0000FF"/>
+        </w:rPr>
+        <w:t xml:space="preserve"> </w:t>
+      </w:r>
+      <w:r>
+        <w:rPr>
+          <w:color w:val="0000FF"/>
+        </w:rPr>
+        <w:t xml:space="preserve">kondisi</w:t>
+      </w:r>
+      <w:r>
+        <w:rPr>
+          <w:color w:val="0000FF"/>
+        </w:rPr>
+        <w:t xml:space="preserve"> </w:t>
+      </w:r>
+      <w:r>
+        <w:rPr>
+          <w:color w:val="0000FF"/>
+        </w:rPr>
+        <w:t xml:space="preserve">operasi</w:t>
+      </w:r>
+      <w:r>
+        <w:rPr>
+          <w:color w:val="0000FF"/>
+        </w:rPr>
+        <w:t xml:space="preserve"> </w:t>
+      </w:r>
+      <w:r>
+        <w:rPr>
+          <w:color w:val="0000FF"/>
+        </w:rPr>
+        <w:t xml:space="preserve">yang</w:t>
+      </w:r>
+      <w:r>
+        <w:rPr>
+          <w:color w:val="0000FF"/>
+        </w:rPr>
+        <w:t xml:space="preserve"> </w:t>
+      </w:r>
+      <w:r>
+        <w:rPr>
+          <w:color w:val="0000FF"/>
+        </w:rPr>
+        <w:t xml:space="preserve">lengkap,</w:t>
+      </w:r>
+      <w:r>
+        <w:rPr>
+          <w:color w:val="0000FF"/>
+        </w:rPr>
+        <w:t xml:space="preserve"> </w:t>
+      </w:r>
+      <w:r>
+        <w:rPr>
+          <w:i/>
+          <w:iCs/>
+          <w:color w:val="0000FF"/>
         </w:rPr>
         <w:t xml:space="preserve">hit-rate</w:t>
       </w:r>
       <w:r>
-        <w:t xml:space="preserve"> </w:t>
-      </w:r>
-      <w:r>
-        <w:t xml:space="preserve">2,2% (23 fitur, p &lt; 0,001) dengan</w:t>
-      </w:r>
-      <w:r>
-        <w:t xml:space="preserve"> </w:t>
-      </w:r>
-      <w:r>
-        <w:rPr>
-          <w:i/>
-          <w:iCs/>
-        </w:rPr>
-        <w:t xml:space="preserve">r</w:t>
-      </w:r>
-      <w:r>
-        <w:t xml:space="preserve"> </w:t>
-      </w:r>
-      <w:r>
-        <w:t xml:space="preserve">= 0,501.</w:t>
+        <w:rPr>
+          <w:color w:val="0000FF"/>
+        </w:rPr>
+        <w:t xml:space="preserve"> </w:t>
+      </w:r>
+      <w:r>
+        <w:rPr>
+          <w:color w:val="0000FF"/>
+        </w:rPr>
+        <w:t xml:space="preserve">tersebar</w:t>
+      </w:r>
+      <w:r>
+        <w:rPr>
+          <w:color w:val="0000FF"/>
+        </w:rPr>
+        <w:t xml:space="preserve"> </w:t>
+      </w:r>
+      <w:r>
+        <w:rPr>
+          <w:color w:val="0000FF"/>
+        </w:rPr>
+        <w:t xml:space="preserve">pada</w:t>
+      </w:r>
+      <w:r>
+        <w:rPr>
+          <w:color w:val="0000FF"/>
+        </w:rPr>
+        <w:t xml:space="preserve"> </w:t>
+      </w:r>
+      <w:r>
+        <w:rPr>
+          <w:color w:val="0000FF"/>
+        </w:rPr>
+        <w:t xml:space="preserve">BPFI</w:t>
+      </w:r>
+      <w:r>
+        <w:rPr>
+          <w:color w:val="0000FF"/>
+        </w:rPr>
+        <w:t xml:space="preserve"> </w:t>
+      </w:r>
+      <w:r>
+        <w:rPr>
+          <w:color w:val="0000FF"/>
+        </w:rPr>
+        <w:t xml:space="preserve">(1</w:t>
+      </w:r>
+      <w:r>
+        <w:rPr>
+          <w:color w:val="0000FF"/>
+        </w:rPr>
+        <w:t xml:space="preserve">,</w:t>
+      </w:r>
+      <w:r>
+        <w:rPr>
+          <w:color w:val="0000FF"/>
+        </w:rPr>
+        <w:t xml:space="preserve">5%),</w:t>
+      </w:r>
+      <w:r>
+        <w:rPr>
+          <w:color w:val="0000FF"/>
+        </w:rPr>
+        <w:t xml:space="preserve"> </w:t>
+      </w:r>
+      <w:r>
+        <w:rPr>
+          <w:color w:val="0000FF"/>
+        </w:rPr>
+        <w:t xml:space="preserve">BSF</w:t>
+      </w:r>
+      <w:r>
+        <w:rPr>
+          <w:color w:val="0000FF"/>
+        </w:rPr>
+        <w:t xml:space="preserve"> </w:t>
+      </w:r>
+      <w:r>
+        <w:rPr>
+          <w:color w:val="0000FF"/>
+        </w:rPr>
+        <w:t xml:space="preserve">(1</w:t>
+      </w:r>
+      <w:r>
+        <w:rPr>
+          <w:color w:val="0000FF"/>
+        </w:rPr>
+        <w:t xml:space="preserve">,</w:t>
+      </w:r>
+      <w:r>
+        <w:rPr>
+          <w:color w:val="0000FF"/>
+        </w:rPr>
+        <w:t xml:space="preserve">6%),</w:t>
+      </w:r>
+      <w:r>
+        <w:rPr>
+          <w:color w:val="0000FF"/>
+        </w:rPr>
+        <w:t xml:space="preserve"> </w:t>
+      </w:r>
+      <w:r>
+        <w:rPr>
+          <w:color w:val="0000FF"/>
+        </w:rPr>
+        <w:t xml:space="preserve">dan</w:t>
+      </w:r>
+      <w:r>
+        <w:rPr>
+          <w:color w:val="0000FF"/>
+        </w:rPr>
+        <w:t xml:space="preserve"> </w:t>
+      </w:r>
+      <w:r>
+        <w:rPr>
+          <w:color w:val="0000FF"/>
+        </w:rPr>
+        <w:t xml:space="preserve">BPFO</w:t>
+      </w:r>
+      <w:r>
+        <w:rPr>
+          <w:color w:val="0000FF"/>
+        </w:rPr>
+        <w:t xml:space="preserve"> </w:t>
+      </w:r>
+      <w:r>
+        <w:rPr>
+          <w:color w:val="0000FF"/>
+        </w:rPr>
+        <w:t xml:space="preserve">(0</w:t>
+      </w:r>
+      <w:r>
+        <w:rPr>
+          <w:color w:val="0000FF"/>
+        </w:rPr>
+        <w:t xml:space="preserve">,</w:t>
+      </w:r>
+      <w:r>
+        <w:rPr>
+          <w:color w:val="0000FF"/>
+        </w:rPr>
+        <w:t xml:space="preserve">7%)</w:t>
+      </w:r>
+      <w:r>
+        <w:rPr>
+          <w:color w:val="0000FF"/>
+        </w:rPr>
+        <w:t xml:space="preserve"> </w:t>
+      </w:r>
+      <w:r>
+        <w:rPr>
+          <w:color w:val="0000FF"/>
+        </w:rPr>
+        <w:t xml:space="preserve">dengan</w:t>
+      </w:r>
+      <w:r>
+        <w:rPr>
+          <w:color w:val="0000FF"/>
+        </w:rPr>
+        <w:t xml:space="preserve"> </w:t>
+      </w:r>
+      <m:oMath>
+        <m:sSub>
+          <m:e>
+            <m:r>
+              <m:t>r</m:t>
+            </m:r>
+          </m:e>
+          <m:sub>
+            <m:r>
+              <m:rPr>
+                <m:sty m:val="p"/>
+              </m:rPr>
+              <m:t>m</m:t>
+            </m:r>
+            <m:r>
+              <m:rPr>
+                <m:sty m:val="p"/>
+              </m:rPr>
+              <m:t>a</m:t>
+            </m:r>
+            <m:r>
+              <m:rPr>
+                <m:sty m:val="p"/>
+              </m:rPr>
+              <m:t>x</m:t>
+            </m:r>
+          </m:sub>
+        </m:sSub>
+        <m:r>
+          <m:rPr>
+            <m:sty m:val="p"/>
+          </m:rPr>
+          <m:t>=</m:t>
+        </m:r>
+        <m:r>
+          <m:t>0</m:t>
+        </m:r>
+        <m:r>
+          <m:rPr>
+            <m:sty m:val="p"/>
+          </m:rPr>
+          <m:t>,</m:t>
+        </m:r>
+        <m:r>
+          <m:t>468</m:t>
+        </m:r>
+      </m:oMath>
+      <w:r>
+        <w:rPr>
+          <w:color w:val="0000FF"/>
+        </w:rPr>
+        <w:t xml:space="preserve"> </w:t>
+      </w:r>
+      <w:r>
+        <w:rPr>
+          <w:color w:val="0000FF"/>
+        </w:rPr>
+        <w:t xml:space="preserve">(</w:t>
+      </w:r>
+      <w:r>
+        <w:rPr>
+          <w:i/>
+          <w:iCs/>
+          <w:color w:val="0000FF"/>
+        </w:rPr>
+        <w:t xml:space="preserve">p</w:t>
+      </w:r>
+      <w:r>
+        <w:rPr>
+          <w:color w:val="0000FF"/>
+        </w:rPr>
+        <w:t xml:space="preserve"> </w:t>
+      </w:r>
+      <w:r>
+        <w:rPr>
+          <w:color w:val="0000FF"/>
+        </w:rPr>
+        <w:t xml:space="preserve">&lt;</w:t>
+      </w:r>
+      <w:r>
+        <w:rPr>
+          <w:color w:val="0000FF"/>
+        </w:rPr>
+        <w:t xml:space="preserve"> </w:t>
+      </w:r>
+      <w:r>
+        <w:rPr>
+          <w:color w:val="0000FF"/>
+        </w:rPr>
+        <w:t xml:space="preserve">0,001),</w:t>
+      </w:r>
+      <w:r>
+        <w:rPr>
+          <w:color w:val="0000FF"/>
+        </w:rPr>
+        <w:t xml:space="preserve"> </w:t>
+      </w:r>
+      <w:r>
+        <w:rPr>
+          <w:color w:val="0000FF"/>
+        </w:rPr>
+        <w:t xml:space="preserve">mencerminkan</w:t>
+      </w:r>
+      <w:r>
+        <w:rPr>
+          <w:color w:val="0000FF"/>
+        </w:rPr>
+        <w:t xml:space="preserve"> </w:t>
+      </w:r>
+      <w:r>
+        <w:rPr>
+          <w:color w:val="0000FF"/>
+        </w:rPr>
+        <w:t xml:space="preserve">keragaman</w:t>
+      </w:r>
+      <w:r>
+        <w:rPr>
+          <w:color w:val="0000FF"/>
+        </w:rPr>
+        <w:t xml:space="preserve"> </w:t>
+      </w:r>
+      <w:r>
+        <w:rPr>
+          <w:color w:val="0000FF"/>
+        </w:rPr>
+        <w:t xml:space="preserve">mode</w:t>
+      </w:r>
+      <w:r>
+        <w:rPr>
+          <w:color w:val="0000FF"/>
+        </w:rPr>
+        <w:t xml:space="preserve"> </w:t>
+      </w:r>
+      <w:r>
+        <w:rPr>
+          <w:color w:val="0000FF"/>
+        </w:rPr>
+        <w:t xml:space="preserve">kegagalan</w:t>
+      </w:r>
+      <w:r>
+        <w:rPr>
+          <w:color w:val="0000FF"/>
+        </w:rPr>
+        <w:t xml:space="preserve"> </w:t>
+      </w:r>
+      <w:r>
+        <w:rPr>
+          <w:color w:val="0000FF"/>
+        </w:rPr>
+        <w:t xml:space="preserve">lintas</w:t>
+      </w:r>
+      <w:r>
+        <w:rPr>
+          <w:color w:val="0000FF"/>
+        </w:rPr>
+        <w:t xml:space="preserve"> </w:t>
+      </w:r>
+      <w:r>
+        <w:rPr>
+          <w:color w:val="0000FF"/>
+        </w:rPr>
+        <w:t xml:space="preserve">kondisi</w:t>
+      </w:r>
+      <w:r>
+        <w:rPr>
+          <w:color w:val="0000FF"/>
+        </w:rPr>
+        <w:t xml:space="preserve"> </w:t>
+      </w:r>
+      <w:r>
+        <w:rPr>
+          <w:color w:val="0000FF"/>
+        </w:rPr>
+        <w:t xml:space="preserve">beban</w:t>
+      </w:r>
+      <w:r>
+        <w:rPr>
+          <w:color w:val="0000FF"/>
+        </w:rPr>
+        <w:t xml:space="preserve"> </w:t>
+      </w:r>
+      <w:r>
+        <w:rPr>
+          <w:color w:val="0000FF"/>
+        </w:rPr>
+        <w:t xml:space="preserve">pada</w:t>
+      </w:r>
+      <w:r>
+        <w:rPr>
+          <w:color w:val="0000FF"/>
+        </w:rPr>
+        <w:t xml:space="preserve"> </w:t>
+      </w:r>
+      <w:r>
+        <w:rPr>
+          <w:color w:val="0000FF"/>
+        </w:rPr>
+        <w:t xml:space="preserve">dataset</w:t>
+      </w:r>
+      <w:r>
+        <w:rPr>
+          <w:color w:val="0000FF"/>
+        </w:rPr>
+        <w:t xml:space="preserve"> </w:t>
+      </w:r>
+      <w:r>
+        <w:rPr>
+          <w:color w:val="0000FF"/>
+        </w:rPr>
+        <w:t xml:space="preserve">yang</w:t>
+      </w:r>
+      <w:r>
+        <w:rPr>
+          <w:color w:val="0000FF"/>
+        </w:rPr>
+        <w:t xml:space="preserve"> </w:t>
+      </w:r>
+      <w:r>
+        <w:rPr>
+          <w:color w:val="0000FF"/>
+        </w:rPr>
+        <w:t xml:space="preserve">diperbaiki.</w:t>
       </w:r>
       <w:r>
         <w:t xml:space="preserve"> </w:t>
@@ -2141,20 +3009,142 @@
         <w:t xml:space="preserve"> </w:t>
       </w:r>
       <w:r>
-        <w:t xml:space="preserve">BPFO untuk XJTU-SY yang didominasi</w:t>
-      </w:r>
-      <w:r>
-        <w:t xml:space="preserve"> </w:t>
-      </w:r>
-      <w:r>
-        <w:rPr>
-          <w:i/>
-          <w:iCs/>
-        </w:rPr>
-        <w:t xml:space="preserve">outer-race spalling</w:t>
-      </w:r>
-      <w:r>
-        <w:t xml:space="preserve">.</w:t>
+        <w:rPr>
+          <w:color w:val="0000FF"/>
+        </w:rPr>
+        <w:t xml:space="preserve">distribusi</w:t>
+      </w:r>
+      <w:r>
+        <w:rPr>
+          <w:color w:val="0000FF"/>
+        </w:rPr>
+        <w:t xml:space="preserve"> </w:t>
+      </w:r>
+      <w:r>
+        <w:rPr>
+          <w:color w:val="0000FF"/>
+        </w:rPr>
+        <w:t xml:space="preserve">BPFI/BSF/BPFO</w:t>
+      </w:r>
+      <w:r>
+        <w:rPr>
+          <w:color w:val="0000FF"/>
+        </w:rPr>
+        <w:t xml:space="preserve"> </w:t>
+      </w:r>
+      <w:r>
+        <w:rPr>
+          <w:color w:val="0000FF"/>
+        </w:rPr>
+        <w:t xml:space="preserve">pada</w:t>
+      </w:r>
+      <w:r>
+        <w:rPr>
+          <w:color w:val="0000FF"/>
+        </w:rPr>
+        <w:t xml:space="preserve"> </w:t>
+      </w:r>
+      <w:r>
+        <w:rPr>
+          <w:color w:val="0000FF"/>
+        </w:rPr>
+        <w:t xml:space="preserve">XJTU-SY</w:t>
+      </w:r>
+      <w:r>
+        <w:rPr>
+          <w:color w:val="0000FF"/>
+        </w:rPr>
+        <w:t xml:space="preserve"> </w:t>
+      </w:r>
+      <w:r>
+        <w:rPr>
+          <w:color w:val="0000FF"/>
+        </w:rPr>
+        <w:t xml:space="preserve">yang</w:t>
+      </w:r>
+      <w:r>
+        <w:rPr>
+          <w:color w:val="0000FF"/>
+        </w:rPr>
+        <w:t xml:space="preserve"> </w:t>
+      </w:r>
+      <w:r>
+        <w:rPr>
+          <w:color w:val="0000FF"/>
+        </w:rPr>
+        <w:t xml:space="preserve">mencerminkan</w:t>
+      </w:r>
+      <w:r>
+        <w:rPr>
+          <w:color w:val="0000FF"/>
+        </w:rPr>
+        <w:t xml:space="preserve"> </w:t>
+      </w:r>
+      <w:r>
+        <w:rPr>
+          <w:color w:val="0000FF"/>
+        </w:rPr>
+        <w:t xml:space="preserve">keragaman</w:t>
+      </w:r>
+      <w:r>
+        <w:rPr>
+          <w:color w:val="0000FF"/>
+        </w:rPr>
+        <w:t xml:space="preserve"> </w:t>
+      </w:r>
+      <w:r>
+        <w:rPr>
+          <w:color w:val="0000FF"/>
+        </w:rPr>
+        <w:t xml:space="preserve">mode</w:t>
+      </w:r>
+      <w:r>
+        <w:rPr>
+          <w:color w:val="0000FF"/>
+        </w:rPr>
+        <w:t xml:space="preserve"> </w:t>
+      </w:r>
+      <w:r>
+        <w:rPr>
+          <w:color w:val="0000FF"/>
+        </w:rPr>
+        <w:t xml:space="preserve">kegagalan</w:t>
+      </w:r>
+      <w:r>
+        <w:rPr>
+          <w:color w:val="0000FF"/>
+        </w:rPr>
+        <w:t xml:space="preserve"> </w:t>
+      </w:r>
+      <w:r>
+        <w:rPr>
+          <w:color w:val="0000FF"/>
+        </w:rPr>
+        <w:t xml:space="preserve">lintas</w:t>
+      </w:r>
+      <w:r>
+        <w:rPr>
+          <w:color w:val="0000FF"/>
+        </w:rPr>
+        <w:t xml:space="preserve"> </w:t>
+      </w:r>
+      <w:r>
+        <w:rPr>
+          <w:color w:val="0000FF"/>
+        </w:rPr>
+        <w:t xml:space="preserve">kondisi</w:t>
+      </w:r>
+      <w:r>
+        <w:rPr>
+          <w:color w:val="0000FF"/>
+        </w:rPr>
+        <w:t xml:space="preserve"> </w:t>
+      </w:r>
+      <w:r>
+        <w:rPr>
+          <w:color w:val="0000FF"/>
+        </w:rPr>
+        <w:t xml:space="preserve">beban.</w:t>
       </w:r>
       <w:r>
         <w:t xml:space="preserve"> </w:t>
@@ -3586,76 +4576,209 @@
         <w:t xml:space="preserve"> </w:t>
       </w:r>
       <w:r>
+        <w:rPr>
+          <w:color w:val="0000FF"/>
+        </w:rPr>
         <w:t xml:space="preserve">penghapusan</w:t>
       </w:r>
       <w:r>
-        <w:t xml:space="preserve"> </w:t>
-      </w:r>
-      <w:r>
-        <w:rPr>
-          <w:i/>
-          <w:iCs/>
+        <w:rPr>
+          <w:color w:val="0000FF"/>
+        </w:rPr>
+        <w:t xml:space="preserve"> </w:t>
+      </w:r>
+      <w:r>
+        <w:rPr>
+          <w:i/>
+          <w:iCs/>
+          <w:color w:val="0000FF"/>
         </w:rPr>
         <w:t xml:space="preserve">BatchNorm</w:t>
       </w:r>
       <w:r>
-        <w:t xml:space="preserve"> </w:t>
-      </w:r>
-      <w:r>
+        <w:rPr>
+          <w:color w:val="0000FF"/>
+        </w:rPr>
+        <w:t xml:space="preserve"> </w:t>
+      </w:r>
+      <w:r>
+        <w:rPr>
+          <w:color w:val="0000FF"/>
+        </w:rPr>
         <w:t xml:space="preserve">menaikkan</w:t>
       </w:r>
       <w:r>
-        <w:t xml:space="preserve"> </w:t>
-      </w:r>
-      <w:r>
-        <w:rPr>
-          <w:i/>
-          <w:iCs/>
+        <w:rPr>
+          <w:color w:val="0000FF"/>
+        </w:rPr>
+        <w:t xml:space="preserve"> </w:t>
+      </w:r>
+      <w:r>
+        <w:rPr>
+          <w:i/>
+          <w:iCs/>
+          <w:color w:val="0000FF"/>
         </w:rPr>
         <w:t xml:space="preserve">discriminability</w:t>
       </w:r>
       <w:r>
-        <w:t xml:space="preserve"> </w:t>
-      </w:r>
-      <w:r>
-        <w:t xml:space="preserve">FSM sebesar 133% (0,315</w:t>
-      </w:r>
-      <w:r>
-        <w:t xml:space="preserve"> </w:t>
-      </w:r>
-      <w:r>
-        <w:t xml:space="preserve">→ 0,735), dengan kata lain</w:t>
-      </w:r>
-      <w:r>
-        <w:t xml:space="preserve"> </w:t>
-      </w:r>
-      <w:r>
-        <w:rPr>
-          <w:i/>
-          <w:iCs/>
+        <w:rPr>
+          <w:color w:val="0000FF"/>
+        </w:rPr>
+        <w:t xml:space="preserve"> </w:t>
+      </w:r>
+      <w:r>
+        <w:rPr>
+          <w:color w:val="0000FF"/>
+        </w:rPr>
+        <w:t xml:space="preserve">FSM</w:t>
+      </w:r>
+      <w:r>
+        <w:rPr>
+          <w:color w:val="0000FF"/>
+        </w:rPr>
+        <w:t xml:space="preserve"> </w:t>
+      </w:r>
+      <w:r>
+        <w:rPr>
+          <w:color w:val="0000FF"/>
+        </w:rPr>
+        <w:t xml:space="preserve">sebesar</w:t>
+      </w:r>
+      <w:r>
+        <w:rPr>
+          <w:color w:val="0000FF"/>
+        </w:rPr>
+        <w:t xml:space="preserve"> </w:t>
+      </w:r>
+      <w:r>
+        <w:rPr>
+          <w:color w:val="0000FF"/>
+        </w:rPr>
+        <w:t xml:space="preserve">133%</w:t>
+      </w:r>
+      <w:r>
+        <w:rPr>
+          <w:color w:val="0000FF"/>
+        </w:rPr>
+        <w:t xml:space="preserve"> </w:t>
+      </w:r>
+      <w:r>
+        <w:rPr>
+          <w:color w:val="0000FF"/>
+        </w:rPr>
+        <w:t xml:space="preserve">(0,315</w:t>
+      </w:r>
+      <w:r>
+        <w:rPr>
+          <w:color w:val="0000FF"/>
+        </w:rPr>
+        <w:t xml:space="preserve"> </w:t>
+      </w:r>
+      <w:r>
+        <w:rPr>
+          <w:color w:val="0000FF"/>
+        </w:rPr>
+        <w:t xml:space="preserve">→</w:t>
+      </w:r>
+      <w:r>
+        <w:rPr>
+          <w:color w:val="0000FF"/>
+        </w:rPr>
+        <w:t xml:space="preserve"> </w:t>
+      </w:r>
+      <w:r>
+        <w:rPr>
+          <w:color w:val="0000FF"/>
+        </w:rPr>
+        <w:t xml:space="preserve">0,735),</w:t>
+      </w:r>
+      <w:r>
+        <w:rPr>
+          <w:color w:val="0000FF"/>
+        </w:rPr>
+        <w:t xml:space="preserve"> </w:t>
+      </w:r>
+      <w:r>
+        <w:rPr>
+          <w:color w:val="0000FF"/>
+        </w:rPr>
+        <w:t xml:space="preserve">dengan</w:t>
+      </w:r>
+      <w:r>
+        <w:rPr>
+          <w:color w:val="0000FF"/>
+        </w:rPr>
+        <w:t xml:space="preserve"> </w:t>
+      </w:r>
+      <w:r>
+        <w:rPr>
+          <w:color w:val="0000FF"/>
+        </w:rPr>
+        <w:t xml:space="preserve">kata</w:t>
+      </w:r>
+      <w:r>
+        <w:rPr>
+          <w:color w:val="0000FF"/>
+        </w:rPr>
+        <w:t xml:space="preserve"> </w:t>
+      </w:r>
+      <w:r>
+        <w:rPr>
+          <w:color w:val="0000FF"/>
+        </w:rPr>
+        <w:t xml:space="preserve">lain</w:t>
+      </w:r>
+      <w:r>
+        <w:rPr>
+          <w:color w:val="0000FF"/>
+        </w:rPr>
+        <w:t xml:space="preserve"> </w:t>
+      </w:r>
+      <w:r>
+        <w:rPr>
+          <w:i/>
+          <w:iCs/>
+          <w:color w:val="0000FF"/>
         </w:rPr>
         <w:t xml:space="preserve">BatchNorm</w:t>
       </w:r>
       <w:r>
-        <w:t xml:space="preserve"> </w:t>
-      </w:r>
-      <w:r>
+        <w:rPr>
+          <w:color w:val="0000FF"/>
+        </w:rPr>
+        <w:t xml:space="preserve"> </w:t>
+      </w:r>
+      <w:r>
+        <w:rPr>
+          <w:color w:val="0000FF"/>
+        </w:rPr>
         <w:t xml:space="preserve">membatasi</w:t>
       </w:r>
       <w:r>
-        <w:t xml:space="preserve"> </w:t>
-      </w:r>
-      <w:r>
-        <w:rPr>
-          <w:i/>
-          <w:iCs/>
+        <w:rPr>
+          <w:color w:val="0000FF"/>
+        </w:rPr>
+        <w:t xml:space="preserve"> </w:t>
+      </w:r>
+      <w:r>
+        <w:rPr>
+          <w:i/>
+          <w:iCs/>
+          <w:color w:val="0000FF"/>
         </w:rPr>
         <w:t xml:space="preserve">discriminability</w:t>
       </w:r>
       <w:r>
-        <w:t xml:space="preserve"> </w:t>
-      </w:r>
-      <w:r>
+        <w:rPr>
+          <w:color w:val="0000FF"/>
+        </w:rPr>
+        <w:t xml:space="preserve"> </w:t>
+      </w:r>
+      <w:r>
+        <w:rPr>
+          <w:color w:val="0000FF"/>
+        </w:rPr>
         <w:t xml:space="preserve">FSM</w:t>
       </w:r>
       <w:r>
@@ -7934,6 +9057,9 @@
     <w:pPr>
       <w:wordWrap w:val="off"/>
     </w:pPr>
+    <w:rPr>
+      <w:rFonts w:ascii="Courier New" w:hAnsi="Courier New"/>
+    </w:rPr>
   </w:style>
   <w:style w:type="character" w:customStyle="1" w:styleId="KeywordTok">
     <w:name w:val="KeywordTok"/>
@@ -8183,6 +9309,15 @@
     <w:rPr>
       <w:rFonts w:ascii="Times New Roman" w:hAnsi="Times New Roman"/>
       <w:sz w:val="24"/>
+    </w:rPr>
+  </w:style>
+  <w:style w:type="character" w:customStyle="1" w:styleId="VerbatimChar">
+    <w:name w:val="Verbatim Char"/>
+    <w:basedOn w:val="DefaultParagraphFont"/>
+    <w:rPr>
+      <w:rFonts w:ascii="Courier New" w:hAnsi="Courier New"/>
+      <w:sz w:val="22"/>
+      <w:szCs w:val="22"/>
     </w:rPr>
   </w:style>
 </w:styles>

</xml_diff>

<commit_message>
feat(dissertation-docx): DOCX manuscript port — Bab I–VI, lampiran, frontmatter
Full port of dissertation manuscript from LaTeX to ITB DOCX template:
- chapters/bab1–bab6.docx, frontmatter, lampiran A–G updated
- disertasi.docx: merged master document
- assets/figures/bab2–5: Bab II–V figures (SAE pipeline, architecture diagrams,
  RUL curves, BPFx heatmaps, ablation, prediction plots)
- assets/figure-map.tsv: updated figure inventory
- assets/color-spans.lua: pandoc filter for color markup
- tools/restyle.py, merge_master.py, build_frontmatter.py: build toolchain
- Makefile: updated build targets

Co-authored-by: Cursor <cursoragent@cursor.com>
</commit_message>
<xml_diff>
--- a/dissertation-docx/chapters/bab6.docx
+++ b/dissertation-docx/chapters/bab6.docx
@@ -494,219 +494,60 @@
         <w:t xml:space="preserve"> </w:t>
       </w:r>
       <w:r>
-        <w:rPr>
-          <w:color w:val="0000FF"/>
-        </w:rPr>
         <w:t xml:space="preserve">menurunkan</w:t>
       </w:r>
       <w:r>
-        <w:rPr>
-          <w:color w:val="0000FF"/>
-        </w:rPr>
-        <w:t xml:space="preserve"> </w:t>
-      </w:r>
-      <w:r>
-        <w:rPr>
-          <w:i/>
-          <w:iCs/>
-          <w:color w:val="0000FF"/>
+        <w:t xml:space="preserve"> </w:t>
+      </w:r>
+      <w:r>
+        <w:rPr>
+          <w:i/>
+          <w:iCs/>
         </w:rPr>
         <w:t xml:space="preserve">discriminability</w:t>
       </w:r>
       <w:r>
-        <w:rPr>
-          <w:color w:val="0000FF"/>
-        </w:rPr>
-        <w:t xml:space="preserve"> </w:t>
-      </w:r>
-      <w:r>
-        <w:rPr>
-          <w:color w:val="0000FF"/>
-        </w:rPr>
-        <w:t xml:space="preserve">FSM;</w:t>
-      </w:r>
-      <w:r>
-        <w:rPr>
-          <w:color w:val="0000FF"/>
-        </w:rPr>
-        <w:t xml:space="preserve"> </w:t>
-      </w:r>
-      <w:r>
-        <w:rPr>
-          <w:color w:val="0000FF"/>
-        </w:rPr>
-        <w:t xml:space="preserve">sebaliknya,</w:t>
-      </w:r>
-      <w:r>
-        <w:rPr>
-          <w:color w:val="0000FF"/>
-        </w:rPr>
-        <w:t xml:space="preserve"> </w:t>
-      </w:r>
-      <w:r>
-        <w:rPr>
-          <w:color w:val="0000FF"/>
-        </w:rPr>
-        <w:t xml:space="preserve">penghapusan</w:t>
-      </w:r>
-      <w:r>
-        <w:rPr>
-          <w:color w:val="0000FF"/>
-        </w:rPr>
-        <w:t xml:space="preserve"> </w:t>
-      </w:r>
-      <w:r>
-        <w:rPr>
-          <w:i/>
-          <w:iCs/>
-          <w:color w:val="0000FF"/>
+        <w:t xml:space="preserve"> </w:t>
+      </w:r>
+      <w:r>
+        <w:t xml:space="preserve">FSM; sebaliknya, penghapusan</w:t>
+      </w:r>
+      <w:r>
+        <w:t xml:space="preserve"> </w:t>
+      </w:r>
+      <w:r>
+        <w:rPr>
+          <w:i/>
+          <w:iCs/>
         </w:rPr>
         <w:t xml:space="preserve">BatchNorm</w:t>
       </w:r>
       <w:r>
-        <w:rPr>
-          <w:color w:val="0000FF"/>
-        </w:rPr>
-        <w:t xml:space="preserve"> </w:t>
-      </w:r>
-      <w:r>
-        <w:rPr>
-          <w:color w:val="0000FF"/>
-        </w:rPr>
+        <w:t xml:space="preserve"> </w:t>
+      </w:r>
+      <w:r>
         <w:t xml:space="preserve">menaikkan</w:t>
       </w:r>
       <w:r>
-        <w:rPr>
-          <w:color w:val="0000FF"/>
-        </w:rPr>
-        <w:t xml:space="preserve"> </w:t>
-      </w:r>
-      <w:r>
-        <w:rPr>
-          <w:i/>
-          <w:iCs/>
-          <w:color w:val="0000FF"/>
+        <w:t xml:space="preserve"> </w:t>
+      </w:r>
+      <w:r>
+        <w:rPr>
+          <w:i/>
+          <w:iCs/>
         </w:rPr>
         <w:t xml:space="preserve">discriminability</w:t>
       </w:r>
       <w:r>
-        <w:rPr>
-          <w:color w:val="0000FF"/>
-        </w:rPr>
-        <w:t xml:space="preserve"> </w:t>
-      </w:r>
-      <w:r>
-        <w:rPr>
-          <w:color w:val="0000FF"/>
-        </w:rPr>
-        <w:t xml:space="preserve">FSM</w:t>
-      </w:r>
-      <w:r>
-        <w:rPr>
-          <w:color w:val="0000FF"/>
-        </w:rPr>
-        <w:t xml:space="preserve"> </w:t>
-      </w:r>
-      <w:r>
-        <w:rPr>
-          <w:color w:val="0000FF"/>
-        </w:rPr>
-        <w:t xml:space="preserve">sebesar</w:t>
-      </w:r>
-      <w:r>
-        <w:rPr>
-          <w:color w:val="0000FF"/>
-        </w:rPr>
-        <w:t xml:space="preserve"> </w:t>
-      </w:r>
-      <w:r>
-        <w:rPr>
-          <w:color w:val="0000FF"/>
-        </w:rPr>
-        <w:t xml:space="preserve">133%</w:t>
-      </w:r>
-      <w:r>
-        <w:rPr>
-          <w:color w:val="0000FF"/>
-        </w:rPr>
-        <w:t xml:space="preserve"> </w:t>
-      </w:r>
-      <w:r>
-        <w:rPr>
-          <w:color w:val="0000FF"/>
-        </w:rPr>
-        <w:t xml:space="preserve">(dari</w:t>
-      </w:r>
-      <w:r>
-        <w:rPr>
-          <w:color w:val="0000FF"/>
-        </w:rPr>
-        <w:t xml:space="preserve"> </w:t>
-      </w:r>
-      <w:r>
-        <w:rPr>
-          <w:color w:val="0000FF"/>
-        </w:rPr>
-        <w:t xml:space="preserve">0,315</w:t>
-      </w:r>
-      <w:r>
-        <w:rPr>
-          <w:color w:val="0000FF"/>
-        </w:rPr>
-        <w:t xml:space="preserve"> </w:t>
-      </w:r>
-      <w:r>
-        <w:rPr>
-          <w:color w:val="0000FF"/>
-        </w:rPr>
-        <w:t xml:space="preserve">menjadi</w:t>
-      </w:r>
-      <w:r>
-        <w:rPr>
-          <w:color w:val="0000FF"/>
-        </w:rPr>
-        <w:t xml:space="preserve"> </w:t>
-      </w:r>
-      <w:r>
-        <w:rPr>
-          <w:color w:val="0000FF"/>
-        </w:rPr>
-        <w:t xml:space="preserve">0,735</w:t>
-      </w:r>
-      <w:r>
-        <w:rPr>
-          <w:color w:val="0000FF"/>
-        </w:rPr>
-        <w:t xml:space="preserve"> </w:t>
-      </w:r>
-      <w:r>
-        <w:rPr>
-          <w:color w:val="0000FF"/>
-        </w:rPr>
-        <w:t xml:space="preserve">pada</w:t>
-      </w:r>
-      <w:r>
-        <w:rPr>
-          <w:color w:val="0000FF"/>
-        </w:rPr>
-        <w:t xml:space="preserve"> </w:t>
-      </w:r>
-      <w:r>
-        <w:rPr>
-          <w:color w:val="0000FF"/>
-        </w:rPr>
-        <w:t xml:space="preserve">subset</w:t>
-      </w:r>
-      <w:r>
-        <w:rPr>
-          <w:color w:val="0000FF"/>
-        </w:rPr>
-        <w:t xml:space="preserve"> </w:t>
-      </w:r>
-      <w:r>
-        <w:rPr>
-          <w:color w:val="0000FF"/>
-        </w:rPr>
+        <w:t xml:space="preserve"> </w:t>
+      </w:r>
+      <w:r>
+        <w:t xml:space="preserve">FSM sebesar 133% (dari 0,315 menjadi 0,735 pada subset</w:t>
+      </w:r>
+      <w:r>
+        <w:t xml:space="preserve"> </w:t>
+      </w:r>
+      <w:r>
         <w:t xml:space="preserve">ablasi)</w:t>
       </w:r>
       <w:r>
@@ -1976,316 +1817,73 @@
         <w:t xml:space="preserve"> </w:t>
       </w:r>
       <w:r>
-        <w:rPr>
-          <w:color w:val="0000FF"/>
-        </w:rPr>
         <w:t xml:space="preserve">menurunkan</w:t>
       </w:r>
       <w:r>
-        <w:rPr>
-          <w:color w:val="0000FF"/>
-        </w:rPr>
-        <w:t xml:space="preserve"> </w:t>
-      </w:r>
-      <w:r>
-        <w:rPr>
-          <w:i/>
-          <w:iCs/>
-          <w:color w:val="0000FF"/>
+        <w:t xml:space="preserve"> </w:t>
+      </w:r>
+      <w:r>
+        <w:rPr>
+          <w:i/>
+          <w:iCs/>
         </w:rPr>
         <w:t xml:space="preserve">discriminability</w:t>
       </w:r>
       <w:r>
-        <w:rPr>
-          <w:color w:val="0000FF"/>
-        </w:rPr>
-        <w:t xml:space="preserve"> </w:t>
-      </w:r>
-      <w:r>
-        <w:rPr>
-          <w:color w:val="0000FF"/>
-        </w:rPr>
-        <w:t xml:space="preserve">FSM;</w:t>
-      </w:r>
-      <w:r>
-        <w:rPr>
-          <w:color w:val="0000FF"/>
-        </w:rPr>
-        <w:t xml:space="preserve"> </w:t>
-      </w:r>
-      <w:r>
-        <w:rPr>
-          <w:color w:val="0000FF"/>
-        </w:rPr>
-        <w:t xml:space="preserve">secara</w:t>
-      </w:r>
-      <w:r>
-        <w:rPr>
-          <w:color w:val="0000FF"/>
-        </w:rPr>
-        <w:t xml:space="preserve"> </w:t>
-      </w:r>
-      <w:r>
-        <w:rPr>
-          <w:color w:val="0000FF"/>
-        </w:rPr>
-        <w:t xml:space="preserve">setara,</w:t>
-      </w:r>
-      <w:r>
-        <w:rPr>
-          <w:color w:val="0000FF"/>
-        </w:rPr>
-        <w:t xml:space="preserve"> </w:t>
-      </w:r>
-      <w:r>
-        <w:rPr>
-          <w:color w:val="0000FF"/>
-        </w:rPr>
+        <w:t xml:space="preserve"> </w:t>
+      </w:r>
+      <w:r>
+        <w:t xml:space="preserve">FSM; secara setara,</w:t>
+      </w:r>
+      <w:r>
+        <w:t xml:space="preserve"> </w:t>
+      </w:r>
+      <w:r>
         <w:t xml:space="preserve">penghapusan</w:t>
       </w:r>
       <w:r>
-        <w:rPr>
-          <w:color w:val="0000FF"/>
-        </w:rPr>
-        <w:t xml:space="preserve"> </w:t>
-      </w:r>
-      <w:r>
-        <w:rPr>
-          <w:i/>
-          <w:iCs/>
-          <w:color w:val="0000FF"/>
+        <w:t xml:space="preserve"> </w:t>
+      </w:r>
+      <w:r>
+        <w:rPr>
+          <w:i/>
+          <w:iCs/>
         </w:rPr>
         <w:t xml:space="preserve">BatchNorm</w:t>
       </w:r>
       <w:r>
-        <w:rPr>
-          <w:color w:val="0000FF"/>
-        </w:rPr>
-        <w:t xml:space="preserve"> </w:t>
-      </w:r>
-      <w:r>
-        <w:rPr>
-          <w:color w:val="0000FF"/>
-        </w:rPr>
+        <w:t xml:space="preserve"> </w:t>
+      </w:r>
+      <w:r>
         <w:t xml:space="preserve">menaikkan</w:t>
       </w:r>
       <w:r>
-        <w:rPr>
-          <w:color w:val="0000FF"/>
-        </w:rPr>
-        <w:t xml:space="preserve"> </w:t>
-      </w:r>
-      <w:r>
-        <w:rPr>
-          <w:i/>
-          <w:iCs/>
-          <w:color w:val="0000FF"/>
+        <w:t xml:space="preserve"> </w:t>
+      </w:r>
+      <w:r>
+        <w:rPr>
+          <w:i/>
+          <w:iCs/>
         </w:rPr>
         <w:t xml:space="preserve">discriminability</w:t>
       </w:r>
       <w:r>
-        <w:rPr>
-          <w:color w:val="0000FF"/>
-        </w:rPr>
-        <w:t xml:space="preserve"> </w:t>
-      </w:r>
-      <w:r>
-        <w:rPr>
-          <w:color w:val="0000FF"/>
-        </w:rPr>
-        <w:t xml:space="preserve">FSM</w:t>
-      </w:r>
-      <w:r>
-        <w:rPr>
-          <w:color w:val="0000FF"/>
-        </w:rPr>
-        <w:t xml:space="preserve"> </w:t>
-      </w:r>
-      <w:r>
-        <w:rPr>
-          <w:color w:val="0000FF"/>
-        </w:rPr>
-        <w:t xml:space="preserve">sebesar</w:t>
-      </w:r>
-      <w:r>
-        <w:rPr>
-          <w:color w:val="0000FF"/>
-        </w:rPr>
-        <w:t xml:space="preserve"> </w:t>
-      </w:r>
-      <w:r>
-        <w:rPr>
-          <w:color w:val="0000FF"/>
-        </w:rPr>
-        <w:t xml:space="preserve">133%,</w:t>
-      </w:r>
-      <w:r>
-        <w:rPr>
-          <w:color w:val="0000FF"/>
-        </w:rPr>
-        <w:t xml:space="preserve"> </w:t>
-      </w:r>
-      <w:r>
-        <w:rPr>
-          <w:color w:val="0000FF"/>
-        </w:rPr>
-        <w:t xml:space="preserve">dari</w:t>
-      </w:r>
-      <w:r>
-        <w:rPr>
-          <w:color w:val="0000FF"/>
-        </w:rPr>
-        <w:t xml:space="preserve"> </w:t>
-      </w:r>
-      <w:r>
-        <w:rPr>
-          <w:color w:val="0000FF"/>
-        </w:rPr>
-        <w:t xml:space="preserve">nilai</w:t>
-      </w:r>
-      <w:r>
-        <w:rPr>
-          <w:color w:val="0000FF"/>
-        </w:rPr>
-        <w:t xml:space="preserve"> </w:t>
-      </w:r>
-      <w:r>
-        <w:rPr>
-          <w:color w:val="0000FF"/>
-        </w:rPr>
-        <w:t xml:space="preserve">0,315</w:t>
-      </w:r>
-      <w:r>
-        <w:rPr>
-          <w:color w:val="0000FF"/>
-        </w:rPr>
-        <w:t xml:space="preserve"> </w:t>
-      </w:r>
-      <w:r>
-        <w:rPr>
-          <w:color w:val="0000FF"/>
-        </w:rPr>
-        <w:t xml:space="preserve">(varian A,</w:t>
-      </w:r>
-      <w:r>
-        <w:rPr>
-          <w:color w:val="0000FF"/>
-        </w:rPr>
-        <w:t xml:space="preserve"> </w:t>
-      </w:r>
-      <w:r>
-        <w:rPr>
-          <w:color w:val="0000FF"/>
-        </w:rPr>
-        <w:t xml:space="preserve">dengan</w:t>
-      </w:r>
-      <w:r>
-        <w:rPr>
-          <w:color w:val="0000FF"/>
-        </w:rPr>
-        <w:t xml:space="preserve"> </w:t>
-      </w:r>
-      <w:r>
-        <w:rPr>
-          <w:color w:val="0000FF"/>
-        </w:rPr>
-        <w:t xml:space="preserve">BN)</w:t>
-      </w:r>
-      <w:r>
-        <w:rPr>
-          <w:color w:val="0000FF"/>
-        </w:rPr>
-        <w:t xml:space="preserve"> </w:t>
-      </w:r>
-      <w:r>
-        <w:rPr>
-          <w:color w:val="0000FF"/>
-        </w:rPr>
-        <w:t xml:space="preserve">menjadi</w:t>
-      </w:r>
-      <w:r>
-        <w:rPr>
-          <w:color w:val="0000FF"/>
-        </w:rPr>
-        <w:t xml:space="preserve"> </w:t>
-      </w:r>
-      <w:r>
-        <w:rPr>
-          <w:color w:val="0000FF"/>
-        </w:rPr>
-        <w:t xml:space="preserve">0,735</w:t>
-      </w:r>
-      <w:r>
-        <w:rPr>
-          <w:color w:val="0000FF"/>
-        </w:rPr>
-        <w:t xml:space="preserve"> </w:t>
-      </w:r>
-      <w:r>
-        <w:rPr>
-          <w:color w:val="0000FF"/>
-        </w:rPr>
-        <w:t xml:space="preserve">(varian C,</w:t>
-      </w:r>
-      <w:r>
-        <w:rPr>
-          <w:color w:val="0000FF"/>
-        </w:rPr>
-        <w:t xml:space="preserve"> </w:t>
-      </w:r>
-      <w:r>
-        <w:rPr>
-          <w:color w:val="0000FF"/>
-        </w:rPr>
-        <w:t xml:space="preserve">tanpa</w:t>
-      </w:r>
-      <w:r>
-        <w:rPr>
-          <w:color w:val="0000FF"/>
-        </w:rPr>
-        <w:t xml:space="preserve"> </w:t>
-      </w:r>
-      <w:r>
-        <w:rPr>
-          <w:color w:val="0000FF"/>
-        </w:rPr>
-        <w:t xml:space="preserve">BN)</w:t>
-      </w:r>
-      <w:r>
-        <w:rPr>
-          <w:color w:val="0000FF"/>
-        </w:rPr>
-        <w:t xml:space="preserve"> </w:t>
-      </w:r>
-      <w:r>
-        <w:rPr>
-          <w:color w:val="0000FF"/>
-        </w:rPr>
-        <w:t xml:space="preserve">pada</w:t>
-      </w:r>
-      <w:r>
-        <w:rPr>
-          <w:color w:val="0000FF"/>
-        </w:rPr>
-        <w:t xml:space="preserve"> </w:t>
-      </w:r>
-      <w:r>
-        <w:rPr>
-          <w:color w:val="0000FF"/>
-        </w:rPr>
-        <w:t xml:space="preserve">subset</w:t>
-      </w:r>
-      <w:r>
-        <w:rPr>
-          <w:color w:val="0000FF"/>
-        </w:rPr>
-        <w:t xml:space="preserve"> </w:t>
-      </w:r>
-      <w:r>
-        <w:rPr>
-          <w:color w:val="0000FF"/>
-        </w:rPr>
-        <w:t xml:space="preserve">ablasi</w:t>
+        <w:t xml:space="preserve"> </w:t>
+      </w:r>
+      <w:r>
+        <w:t xml:space="preserve">FSM sebesar 133%,</w:t>
+      </w:r>
+      <w:r>
+        <w:t xml:space="preserve"> </w:t>
+      </w:r>
+      <w:r>
+        <w:t xml:space="preserve">dari nilai 0,315 (varian A, dengan BN) menjadi 0,735 (varian C, tanpa BN) pada</w:t>
+      </w:r>
+      <w:r>
+        <w:t xml:space="preserve"> </w:t>
+      </w:r>
+      <w:r>
+        <w:t xml:space="preserve">subset ablasi</w:t>
       </w:r>
       <w:r>
         <w:t xml:space="preserve">. Temuan ini memberikan panduan</w:t>
@@ -2480,281 +2078,55 @@
         <w:t xml:space="preserve"> </w:t>
       </w:r>
       <w:r>
-        <w:rPr>
-          <w:color w:val="0000FF"/>
-        </w:rPr>
-        <w:t xml:space="preserve">Pada</w:t>
-      </w:r>
-      <w:r>
-        <w:rPr>
-          <w:color w:val="0000FF"/>
-        </w:rPr>
-        <w:t xml:space="preserve"> </w:t>
-      </w:r>
-      <w:r>
-        <w:rPr>
-          <w:color w:val="0000FF"/>
-        </w:rPr>
-        <w:t xml:space="preserve">XJTU-SY</w:t>
-      </w:r>
-      <w:r>
-        <w:rPr>
-          <w:color w:val="0000FF"/>
-        </w:rPr>
-        <w:t xml:space="preserve"> </w:t>
-      </w:r>
-      <w:r>
-        <w:rPr>
-          <w:color w:val="0000FF"/>
-        </w:rPr>
-        <w:t xml:space="preserve">dengan</w:t>
-      </w:r>
-      <w:r>
-        <w:rPr>
-          <w:color w:val="0000FF"/>
-        </w:rPr>
-        <w:t xml:space="preserve"> </w:t>
-      </w:r>
-      <w:r>
-        <w:rPr>
-          <w:color w:val="0000FF"/>
-        </w:rPr>
-        <w:t xml:space="preserve">dataset</w:t>
-      </w:r>
-      <w:r>
-        <w:rPr>
-          <w:color w:val="0000FF"/>
-        </w:rPr>
-        <w:t xml:space="preserve"> </w:t>
-      </w:r>
-      <w:r>
-        <w:rPr>
-          <w:color w:val="0000FF"/>
-        </w:rPr>
-        <w:t xml:space="preserve">tiga</w:t>
-      </w:r>
-      <w:r>
-        <w:rPr>
-          <w:color w:val="0000FF"/>
-        </w:rPr>
-        <w:t xml:space="preserve"> </w:t>
-      </w:r>
-      <w:r>
-        <w:rPr>
-          <w:color w:val="0000FF"/>
-        </w:rPr>
-        <w:t xml:space="preserve">kondisi</w:t>
-      </w:r>
-      <w:r>
-        <w:rPr>
-          <w:color w:val="0000FF"/>
-        </w:rPr>
-        <w:t xml:space="preserve"> </w:t>
-      </w:r>
-      <w:r>
-        <w:rPr>
-          <w:color w:val="0000FF"/>
-        </w:rPr>
-        <w:t xml:space="preserve">operasi</w:t>
-      </w:r>
-      <w:r>
-        <w:rPr>
-          <w:color w:val="0000FF"/>
-        </w:rPr>
-        <w:t xml:space="preserve"> </w:t>
-      </w:r>
-      <w:r>
-        <w:rPr>
-          <w:color w:val="0000FF"/>
-        </w:rPr>
-        <w:t xml:space="preserve">yang</w:t>
-      </w:r>
-      <w:r>
-        <w:rPr>
-          <w:color w:val="0000FF"/>
-        </w:rPr>
-        <w:t xml:space="preserve"> </w:t>
-      </w:r>
-      <w:r>
-        <w:rPr>
-          <w:color w:val="0000FF"/>
-        </w:rPr>
-        <w:t xml:space="preserve">lengkap,</w:t>
-      </w:r>
-      <w:r>
-        <w:rPr>
-          <w:color w:val="0000FF"/>
-        </w:rPr>
-        <w:t xml:space="preserve"> </w:t>
-      </w:r>
-      <w:r>
-        <w:rPr>
-          <w:i/>
-          <w:iCs/>
-          <w:color w:val="0000FF"/>
+        <w:t xml:space="preserve">Pada XJTU-SY</w:t>
+      </w:r>
+      <w:r>
+        <w:t xml:space="preserve"> </w:t>
+      </w:r>
+      <w:r>
+        <w:t xml:space="preserve">dengan dataset tiga kondisi operasi yang lengkap,</w:t>
+      </w:r>
+      <w:r>
+        <w:t xml:space="preserve"> </w:t>
+      </w:r>
+      <w:r>
+        <w:rPr>
+          <w:i/>
+          <w:iCs/>
         </w:rPr>
         <w:t xml:space="preserve">hit-rate</w:t>
       </w:r>
       <w:r>
-        <w:rPr>
-          <w:color w:val="0000FF"/>
-        </w:rPr>
-        <w:t xml:space="preserve"> </w:t>
-      </w:r>
-      <w:r>
-        <w:rPr>
-          <w:color w:val="0000FF"/>
-        </w:rPr>
-        <w:t xml:space="preserve">tersebar</w:t>
-      </w:r>
-      <w:r>
-        <w:rPr>
-          <w:color w:val="0000FF"/>
-        </w:rPr>
-        <w:t xml:space="preserve"> </w:t>
-      </w:r>
-      <w:r>
-        <w:rPr>
-          <w:color w:val="0000FF"/>
-        </w:rPr>
-        <w:t xml:space="preserve">pada</w:t>
-      </w:r>
-      <w:r>
-        <w:rPr>
-          <w:color w:val="0000FF"/>
-        </w:rPr>
-        <w:t xml:space="preserve"> </w:t>
-      </w:r>
-      <w:r>
-        <w:rPr>
-          <w:color w:val="0000FF"/>
-        </w:rPr>
-        <w:t xml:space="preserve">BPFI</w:t>
-      </w:r>
-      <w:r>
-        <w:rPr>
-          <w:color w:val="0000FF"/>
-        </w:rPr>
-        <w:t xml:space="preserve"> </w:t>
-      </w:r>
-      <w:r>
-        <w:rPr>
-          <w:color w:val="0000FF"/>
-        </w:rPr>
-        <w:t xml:space="preserve">(1</w:t>
-      </w:r>
-      <w:r>
-        <w:rPr>
-          <w:color w:val="0000FF"/>
-        </w:rPr>
+        <w:t xml:space="preserve"> </w:t>
+      </w:r>
+      <w:r>
+        <w:t xml:space="preserve">tersebar pada</w:t>
+      </w:r>
+      <w:r>
+        <w:t xml:space="preserve"> </w:t>
+      </w:r>
+      <w:r>
+        <w:t xml:space="preserve">BPFI (1</w:t>
+      </w:r>
+      <w:r>
         <w:t xml:space="preserve">,</w:t>
       </w:r>
       <w:r>
-        <w:rPr>
-          <w:color w:val="0000FF"/>
-        </w:rPr>
-        <w:t xml:space="preserve">5%),</w:t>
-      </w:r>
-      <w:r>
-        <w:rPr>
-          <w:color w:val="0000FF"/>
-        </w:rPr>
-        <w:t xml:space="preserve"> </w:t>
-      </w:r>
-      <w:r>
-        <w:rPr>
-          <w:color w:val="0000FF"/>
-        </w:rPr>
-        <w:t xml:space="preserve">BSF</w:t>
-      </w:r>
-      <w:r>
-        <w:rPr>
-          <w:color w:val="0000FF"/>
-        </w:rPr>
-        <w:t xml:space="preserve"> </w:t>
-      </w:r>
-      <w:r>
-        <w:rPr>
-          <w:color w:val="0000FF"/>
-        </w:rPr>
-        <w:t xml:space="preserve">(1</w:t>
-      </w:r>
-      <w:r>
-        <w:rPr>
-          <w:color w:val="0000FF"/>
-        </w:rPr>
+        <w:t xml:space="preserve">5%), BSF (1</w:t>
+      </w:r>
+      <w:r>
         <w:t xml:space="preserve">,</w:t>
       </w:r>
       <w:r>
-        <w:rPr>
-          <w:color w:val="0000FF"/>
-        </w:rPr>
-        <w:t xml:space="preserve">6%),</w:t>
-      </w:r>
-      <w:r>
-        <w:rPr>
-          <w:color w:val="0000FF"/>
-        </w:rPr>
-        <w:t xml:space="preserve"> </w:t>
-      </w:r>
-      <w:r>
-        <w:rPr>
-          <w:color w:val="0000FF"/>
-        </w:rPr>
-        <w:t xml:space="preserve">dan</w:t>
-      </w:r>
-      <w:r>
-        <w:rPr>
-          <w:color w:val="0000FF"/>
-        </w:rPr>
-        <w:t xml:space="preserve"> </w:t>
-      </w:r>
-      <w:r>
-        <w:rPr>
-          <w:color w:val="0000FF"/>
-        </w:rPr>
-        <w:t xml:space="preserve">BPFO</w:t>
-      </w:r>
-      <w:r>
-        <w:rPr>
-          <w:color w:val="0000FF"/>
-        </w:rPr>
-        <w:t xml:space="preserve"> </w:t>
-      </w:r>
-      <w:r>
-        <w:rPr>
-          <w:color w:val="0000FF"/>
-        </w:rPr>
-        <w:t xml:space="preserve">(0</w:t>
-      </w:r>
-      <w:r>
-        <w:rPr>
-          <w:color w:val="0000FF"/>
-        </w:rPr>
+        <w:t xml:space="preserve">6%), dan BPFO (0</w:t>
+      </w:r>
+      <w:r>
         <w:t xml:space="preserve">,</w:t>
       </w:r>
       <w:r>
-        <w:rPr>
-          <w:color w:val="0000FF"/>
-        </w:rPr>
-        <w:t xml:space="preserve">7%)</w:t>
-      </w:r>
-      <w:r>
-        <w:rPr>
-          <w:color w:val="0000FF"/>
-        </w:rPr>
-        <w:t xml:space="preserve"> </w:t>
-      </w:r>
-      <w:r>
-        <w:rPr>
-          <w:color w:val="0000FF"/>
-        </w:rPr>
-        <w:t xml:space="preserve">dengan</w:t>
-      </w:r>
-      <w:r>
-        <w:rPr>
-          <w:color w:val="0000FF"/>
-        </w:rPr>
+        <w:t xml:space="preserve">7%) dengan</w:t>
+      </w:r>
+      <w:r>
         <w:t xml:space="preserve"> </w:t>
       </w:r>
       <m:oMath>
@@ -2805,180 +2177,29 @@
         </m:r>
       </m:oMath>
       <w:r>
-        <w:rPr>
-          <w:color w:val="0000FF"/>
-        </w:rPr>
-        <w:t xml:space="preserve"> </w:t>
-      </w:r>
-      <w:r>
-        <w:rPr>
-          <w:color w:val="0000FF"/>
-        </w:rPr>
+        <w:t xml:space="preserve"> </w:t>
+      </w:r>
+      <w:r>
         <w:t xml:space="preserve">(</w:t>
       </w:r>
       <w:r>
         <w:rPr>
           <w:i/>
           <w:iCs/>
-          <w:color w:val="0000FF"/>
         </w:rPr>
         <w:t xml:space="preserve">p</w:t>
       </w:r>
       <w:r>
-        <w:rPr>
-          <w:color w:val="0000FF"/>
-        </w:rPr>
-        <w:t xml:space="preserve"> </w:t>
-      </w:r>
-      <w:r>
-        <w:rPr>
-          <w:color w:val="0000FF"/>
-        </w:rPr>
-        <w:t xml:space="preserve">&lt;</w:t>
-      </w:r>
-      <w:r>
-        <w:rPr>
-          <w:color w:val="0000FF"/>
-        </w:rPr>
-        <w:t xml:space="preserve"> </w:t>
-      </w:r>
-      <w:r>
-        <w:rPr>
-          <w:color w:val="0000FF"/>
-        </w:rPr>
-        <w:t xml:space="preserve">0,001),</w:t>
-      </w:r>
-      <w:r>
-        <w:rPr>
-          <w:color w:val="0000FF"/>
-        </w:rPr>
-        <w:t xml:space="preserve"> </w:t>
-      </w:r>
-      <w:r>
-        <w:rPr>
-          <w:color w:val="0000FF"/>
-        </w:rPr>
-        <w:t xml:space="preserve">mencerminkan</w:t>
-      </w:r>
-      <w:r>
-        <w:rPr>
-          <w:color w:val="0000FF"/>
-        </w:rPr>
-        <w:t xml:space="preserve"> </w:t>
-      </w:r>
-      <w:r>
-        <w:rPr>
-          <w:color w:val="0000FF"/>
-        </w:rPr>
-        <w:t xml:space="preserve">keragaman</w:t>
-      </w:r>
-      <w:r>
-        <w:rPr>
-          <w:color w:val="0000FF"/>
-        </w:rPr>
-        <w:t xml:space="preserve"> </w:t>
-      </w:r>
-      <w:r>
-        <w:rPr>
-          <w:color w:val="0000FF"/>
-        </w:rPr>
-        <w:t xml:space="preserve">mode</w:t>
-      </w:r>
-      <w:r>
-        <w:rPr>
-          <w:color w:val="0000FF"/>
-        </w:rPr>
-        <w:t xml:space="preserve"> </w:t>
-      </w:r>
-      <w:r>
-        <w:rPr>
-          <w:color w:val="0000FF"/>
-        </w:rPr>
-        <w:t xml:space="preserve">kegagalan</w:t>
-      </w:r>
-      <w:r>
-        <w:rPr>
-          <w:color w:val="0000FF"/>
-        </w:rPr>
-        <w:t xml:space="preserve"> </w:t>
-      </w:r>
-      <w:r>
-        <w:rPr>
-          <w:color w:val="0000FF"/>
-        </w:rPr>
-        <w:t xml:space="preserve">lintas</w:t>
-      </w:r>
-      <w:r>
-        <w:rPr>
-          <w:color w:val="0000FF"/>
-        </w:rPr>
-        <w:t xml:space="preserve"> </w:t>
-      </w:r>
-      <w:r>
-        <w:rPr>
-          <w:color w:val="0000FF"/>
-        </w:rPr>
-        <w:t xml:space="preserve">kondisi</w:t>
-      </w:r>
-      <w:r>
-        <w:rPr>
-          <w:color w:val="0000FF"/>
-        </w:rPr>
-        <w:t xml:space="preserve"> </w:t>
-      </w:r>
-      <w:r>
-        <w:rPr>
-          <w:color w:val="0000FF"/>
-        </w:rPr>
-        <w:t xml:space="preserve">beban</w:t>
-      </w:r>
-      <w:r>
-        <w:rPr>
-          <w:color w:val="0000FF"/>
-        </w:rPr>
-        <w:t xml:space="preserve"> </w:t>
-      </w:r>
-      <w:r>
-        <w:rPr>
-          <w:color w:val="0000FF"/>
-        </w:rPr>
-        <w:t xml:space="preserve">pada</w:t>
-      </w:r>
-      <w:r>
-        <w:rPr>
-          <w:color w:val="0000FF"/>
-        </w:rPr>
-        <w:t xml:space="preserve"> </w:t>
-      </w:r>
-      <w:r>
-        <w:rPr>
-          <w:color w:val="0000FF"/>
-        </w:rPr>
-        <w:t xml:space="preserve">dataset</w:t>
-      </w:r>
-      <w:r>
-        <w:rPr>
-          <w:color w:val="0000FF"/>
-        </w:rPr>
-        <w:t xml:space="preserve"> </w:t>
-      </w:r>
-      <w:r>
-        <w:rPr>
-          <w:color w:val="0000FF"/>
-        </w:rPr>
-        <w:t xml:space="preserve">yang</w:t>
-      </w:r>
-      <w:r>
-        <w:rPr>
-          <w:color w:val="0000FF"/>
-        </w:rPr>
-        <w:t xml:space="preserve"> </w:t>
-      </w:r>
-      <w:r>
-        <w:rPr>
-          <w:color w:val="0000FF"/>
-        </w:rPr>
-        <w:t xml:space="preserve">diperbaiki.</w:t>
+        <w:t xml:space="preserve"> </w:t>
+      </w:r>
+      <w:r>
+        <w:t xml:space="preserve">&lt; 0,001), mencerminkan keragaman mode kegagalan lintas kondisi beban</w:t>
+      </w:r>
+      <w:r>
+        <w:t xml:space="preserve"> </w:t>
+      </w:r>
+      <w:r>
+        <w:t xml:space="preserve">pada dataset yang diperbaiki.</w:t>
       </w:r>
       <w:r>
         <w:t xml:space="preserve"> </w:t>
@@ -3009,142 +2230,13 @@
         <w:t xml:space="preserve"> </w:t>
       </w:r>
       <w:r>
-        <w:rPr>
-          <w:color w:val="0000FF"/>
-        </w:rPr>
-        <w:t xml:space="preserve">distribusi</w:t>
-      </w:r>
-      <w:r>
-        <w:rPr>
-          <w:color w:val="0000FF"/>
-        </w:rPr>
-        <w:t xml:space="preserve"> </w:t>
-      </w:r>
-      <w:r>
-        <w:rPr>
-          <w:color w:val="0000FF"/>
-        </w:rPr>
-        <w:t xml:space="preserve">BPFI/BSF/BPFO</w:t>
-      </w:r>
-      <w:r>
-        <w:rPr>
-          <w:color w:val="0000FF"/>
-        </w:rPr>
-        <w:t xml:space="preserve"> </w:t>
-      </w:r>
-      <w:r>
-        <w:rPr>
-          <w:color w:val="0000FF"/>
-        </w:rPr>
-        <w:t xml:space="preserve">pada</w:t>
-      </w:r>
-      <w:r>
-        <w:rPr>
-          <w:color w:val="0000FF"/>
-        </w:rPr>
-        <w:t xml:space="preserve"> </w:t>
-      </w:r>
-      <w:r>
-        <w:rPr>
-          <w:color w:val="0000FF"/>
-        </w:rPr>
-        <w:t xml:space="preserve">XJTU-SY</w:t>
-      </w:r>
-      <w:r>
-        <w:rPr>
-          <w:color w:val="0000FF"/>
-        </w:rPr>
-        <w:t xml:space="preserve"> </w:t>
-      </w:r>
-      <w:r>
-        <w:rPr>
-          <w:color w:val="0000FF"/>
-        </w:rPr>
-        <w:t xml:space="preserve">yang</w:t>
-      </w:r>
-      <w:r>
-        <w:rPr>
-          <w:color w:val="0000FF"/>
-        </w:rPr>
-        <w:t xml:space="preserve"> </w:t>
-      </w:r>
-      <w:r>
-        <w:rPr>
-          <w:color w:val="0000FF"/>
-        </w:rPr>
-        <w:t xml:space="preserve">mencerminkan</w:t>
-      </w:r>
-      <w:r>
-        <w:rPr>
-          <w:color w:val="0000FF"/>
-        </w:rPr>
-        <w:t xml:space="preserve"> </w:t>
-      </w:r>
-      <w:r>
-        <w:rPr>
-          <w:color w:val="0000FF"/>
-        </w:rPr>
-        <w:t xml:space="preserve">keragaman</w:t>
-      </w:r>
-      <w:r>
-        <w:rPr>
-          <w:color w:val="0000FF"/>
-        </w:rPr>
-        <w:t xml:space="preserve"> </w:t>
-      </w:r>
-      <w:r>
-        <w:rPr>
-          <w:color w:val="0000FF"/>
-        </w:rPr>
-        <w:t xml:space="preserve">mode</w:t>
-      </w:r>
-      <w:r>
-        <w:rPr>
-          <w:color w:val="0000FF"/>
-        </w:rPr>
-        <w:t xml:space="preserve"> </w:t>
-      </w:r>
-      <w:r>
-        <w:rPr>
-          <w:color w:val="0000FF"/>
-        </w:rPr>
-        <w:t xml:space="preserve">kegagalan</w:t>
-      </w:r>
-      <w:r>
-        <w:rPr>
-          <w:color w:val="0000FF"/>
-        </w:rPr>
-        <w:t xml:space="preserve"> </w:t>
-      </w:r>
-      <w:r>
-        <w:rPr>
-          <w:color w:val="0000FF"/>
-        </w:rPr>
-        <w:t xml:space="preserve">lintas</w:t>
-      </w:r>
-      <w:r>
-        <w:rPr>
-          <w:color w:val="0000FF"/>
-        </w:rPr>
-        <w:t xml:space="preserve"> </w:t>
-      </w:r>
-      <w:r>
-        <w:rPr>
-          <w:color w:val="0000FF"/>
-        </w:rPr>
-        <w:t xml:space="preserve">kondisi</w:t>
-      </w:r>
-      <w:r>
-        <w:rPr>
-          <w:color w:val="0000FF"/>
-        </w:rPr>
-        <w:t xml:space="preserve"> </w:t>
-      </w:r>
-      <w:r>
-        <w:rPr>
-          <w:color w:val="0000FF"/>
-        </w:rPr>
-        <w:t xml:space="preserve">beban.</w:t>
+        <w:t xml:space="preserve">distribusi BPFI/BSF/BPFO pada XJTU-SY yang mencerminkan keragaman mode</w:t>
+      </w:r>
+      <w:r>
+        <w:t xml:space="preserve"> </w:t>
+      </w:r>
+      <w:r>
+        <w:t xml:space="preserve">kegagalan lintas kondisi beban.</w:t>
       </w:r>
       <w:r>
         <w:t xml:space="preserve"> </w:t>
@@ -4576,209 +3668,76 @@
         <w:t xml:space="preserve"> </w:t>
       </w:r>
       <w:r>
-        <w:rPr>
-          <w:color w:val="0000FF"/>
-        </w:rPr>
         <w:t xml:space="preserve">penghapusan</w:t>
       </w:r>
       <w:r>
-        <w:rPr>
-          <w:color w:val="0000FF"/>
-        </w:rPr>
-        <w:t xml:space="preserve"> </w:t>
-      </w:r>
-      <w:r>
-        <w:rPr>
-          <w:i/>
-          <w:iCs/>
-          <w:color w:val="0000FF"/>
+        <w:t xml:space="preserve"> </w:t>
+      </w:r>
+      <w:r>
+        <w:rPr>
+          <w:i/>
+          <w:iCs/>
         </w:rPr>
         <w:t xml:space="preserve">BatchNorm</w:t>
       </w:r>
       <w:r>
-        <w:rPr>
-          <w:color w:val="0000FF"/>
-        </w:rPr>
-        <w:t xml:space="preserve"> </w:t>
-      </w:r>
-      <w:r>
-        <w:rPr>
-          <w:color w:val="0000FF"/>
-        </w:rPr>
+        <w:t xml:space="preserve"> </w:t>
+      </w:r>
+      <w:r>
         <w:t xml:space="preserve">menaikkan</w:t>
       </w:r>
       <w:r>
-        <w:rPr>
-          <w:color w:val="0000FF"/>
-        </w:rPr>
-        <w:t xml:space="preserve"> </w:t>
-      </w:r>
-      <w:r>
-        <w:rPr>
-          <w:i/>
-          <w:iCs/>
-          <w:color w:val="0000FF"/>
+        <w:t xml:space="preserve"> </w:t>
+      </w:r>
+      <w:r>
+        <w:rPr>
+          <w:i/>
+          <w:iCs/>
         </w:rPr>
         <w:t xml:space="preserve">discriminability</w:t>
       </w:r>
       <w:r>
-        <w:rPr>
-          <w:color w:val="0000FF"/>
-        </w:rPr>
-        <w:t xml:space="preserve"> </w:t>
-      </w:r>
-      <w:r>
-        <w:rPr>
-          <w:color w:val="0000FF"/>
-        </w:rPr>
-        <w:t xml:space="preserve">FSM</w:t>
-      </w:r>
-      <w:r>
-        <w:rPr>
-          <w:color w:val="0000FF"/>
-        </w:rPr>
-        <w:t xml:space="preserve"> </w:t>
-      </w:r>
-      <w:r>
-        <w:rPr>
-          <w:color w:val="0000FF"/>
-        </w:rPr>
-        <w:t xml:space="preserve">sebesar</w:t>
-      </w:r>
-      <w:r>
-        <w:rPr>
-          <w:color w:val="0000FF"/>
-        </w:rPr>
-        <w:t xml:space="preserve"> </w:t>
-      </w:r>
-      <w:r>
-        <w:rPr>
-          <w:color w:val="0000FF"/>
-        </w:rPr>
-        <w:t xml:space="preserve">133%</w:t>
-      </w:r>
-      <w:r>
-        <w:rPr>
-          <w:color w:val="0000FF"/>
-        </w:rPr>
-        <w:t xml:space="preserve"> </w:t>
-      </w:r>
-      <w:r>
-        <w:rPr>
-          <w:color w:val="0000FF"/>
-        </w:rPr>
-        <w:t xml:space="preserve">(0,315</w:t>
-      </w:r>
-      <w:r>
-        <w:rPr>
-          <w:color w:val="0000FF"/>
-        </w:rPr>
-        <w:t xml:space="preserve"> </w:t>
-      </w:r>
-      <w:r>
-        <w:rPr>
-          <w:color w:val="0000FF"/>
-        </w:rPr>
-        <w:t xml:space="preserve">→</w:t>
-      </w:r>
-      <w:r>
-        <w:rPr>
-          <w:color w:val="0000FF"/>
-        </w:rPr>
-        <w:t xml:space="preserve"> </w:t>
-      </w:r>
-      <w:r>
-        <w:rPr>
-          <w:color w:val="0000FF"/>
-        </w:rPr>
-        <w:t xml:space="preserve">0,735),</w:t>
-      </w:r>
-      <w:r>
-        <w:rPr>
-          <w:color w:val="0000FF"/>
-        </w:rPr>
-        <w:t xml:space="preserve"> </w:t>
-      </w:r>
-      <w:r>
-        <w:rPr>
-          <w:color w:val="0000FF"/>
-        </w:rPr>
-        <w:t xml:space="preserve">dengan</w:t>
-      </w:r>
-      <w:r>
-        <w:rPr>
-          <w:color w:val="0000FF"/>
-        </w:rPr>
-        <w:t xml:space="preserve"> </w:t>
-      </w:r>
-      <w:r>
-        <w:rPr>
-          <w:color w:val="0000FF"/>
-        </w:rPr>
-        <w:t xml:space="preserve">kata</w:t>
-      </w:r>
-      <w:r>
-        <w:rPr>
-          <w:color w:val="0000FF"/>
-        </w:rPr>
-        <w:t xml:space="preserve"> </w:t>
-      </w:r>
-      <w:r>
-        <w:rPr>
-          <w:color w:val="0000FF"/>
-        </w:rPr>
-        <w:t xml:space="preserve">lain</w:t>
-      </w:r>
-      <w:r>
-        <w:rPr>
-          <w:color w:val="0000FF"/>
-        </w:rPr>
-        <w:t xml:space="preserve"> </w:t>
-      </w:r>
-      <w:r>
-        <w:rPr>
-          <w:i/>
-          <w:iCs/>
-          <w:color w:val="0000FF"/>
+        <w:t xml:space="preserve"> </w:t>
+      </w:r>
+      <w:r>
+        <w:t xml:space="preserve">FSM sebesar 133% (0,315</w:t>
+      </w:r>
+      <w:r>
+        <w:t xml:space="preserve"> </w:t>
+      </w:r>
+      <w:r>
+        <w:t xml:space="preserve">→ 0,735), dengan kata lain</w:t>
+      </w:r>
+      <w:r>
+        <w:t xml:space="preserve"> </w:t>
+      </w:r>
+      <w:r>
+        <w:rPr>
+          <w:i/>
+          <w:iCs/>
         </w:rPr>
         <w:t xml:space="preserve">BatchNorm</w:t>
       </w:r>
       <w:r>
-        <w:rPr>
-          <w:color w:val="0000FF"/>
-        </w:rPr>
-        <w:t xml:space="preserve"> </w:t>
-      </w:r>
-      <w:r>
-        <w:rPr>
-          <w:color w:val="0000FF"/>
-        </w:rPr>
+        <w:t xml:space="preserve"> </w:t>
+      </w:r>
+      <w:r>
         <w:t xml:space="preserve">membatasi</w:t>
       </w:r>
       <w:r>
-        <w:rPr>
-          <w:color w:val="0000FF"/>
-        </w:rPr>
-        <w:t xml:space="preserve"> </w:t>
-      </w:r>
-      <w:r>
-        <w:rPr>
-          <w:i/>
-          <w:iCs/>
-          <w:color w:val="0000FF"/>
+        <w:t xml:space="preserve"> </w:t>
+      </w:r>
+      <w:r>
+        <w:rPr>
+          <w:i/>
+          <w:iCs/>
         </w:rPr>
         <w:t xml:space="preserve">discriminability</w:t>
       </w:r>
       <w:r>
-        <w:rPr>
-          <w:color w:val="0000FF"/>
-        </w:rPr>
-        <w:t xml:space="preserve"> </w:t>
-      </w:r>
-      <w:r>
-        <w:rPr>
-          <w:color w:val="0000FF"/>
-        </w:rPr>
+        <w:t xml:space="preserve"> </w:t>
+      </w:r>
+      <w:r>
         <w:t xml:space="preserve">FSM</w:t>
       </w:r>
       <w:r>
@@ -5319,7 +4278,7 @@
       <w:type w:val="continuous"/>
       <w:pgSz w:code="9" w:h="16839" w:w="11907"/>
       <w:pgMar w:bottom="1699" w:footer="720" w:gutter="0" w:header="720" w:left="2275" w:right="1699" w:top="1699"/>
-      <w:pgNumType w:fmt="decimal" w:start="105"/>
+      <w:pgNumType w:fmt="decimal" w:start="117"/>
       <w:cols w:space="720"/>
       <w:docGrid w:linePitch="360"/>
     </w:sectPr>

</xml_diff>